<commit_message>
nmv 29 04 2026
</commit_message>
<xml_diff>
--- a/TS Jatai Ghanam Project/TS 1.3/TS 1.3 Ghanam Malayalam Corrections.docx
+++ b/TS Jatai Ghanam Project/TS 1.3/TS 1.3 Ghanam Malayalam Corrections.docx
@@ -1,7 +1,632 @@
 
 <file path=word/document.xml><?xml version="1.0" encoding="utf-8"?>
-<w:document xmlns:wpc="http://schemas.microsoft.com/office/word/2010/wordprocessingCanvas" xmlns:cx="http://schemas.microsoft.com/office/drawing/2014/chartex" xmlns:cx1="http://schemas.microsoft.com/office/drawing/2015/9/8/chartex" xmlns:cx2="http://schemas.microsoft.com/office/drawing/2015/10/21/chartex" xmlns:cx3="http://schemas.microsoft.com/office/drawing/2016/5/9/chartex" xmlns:cx4="http://schemas.microsoft.com/office/drawing/2016/5/10/chartex" xmlns:cx5="http://schemas.microsoft.com/office/drawing/2016/5/11/chartex" xmlns:cx6="http://schemas.microsoft.com/office/drawing/2016/5/12/chartex" xmlns:cx7="http://schemas.microsoft.com/office/drawing/2016/5/13/chartex" xmlns:cx8="http://schemas.microsoft.com/office/drawing/2016/5/14/chartex" xmlns:mc="http://schemas.openxmlformats.org/markup-compatibility/2006" xmlns:aink="http://schemas.microsoft.com/office/drawing/2016/ink" xmlns:am3d="http://schemas.microsoft.com/office/drawing/2017/model3d" xmlns:o="urn:schemas-microsoft-com:office:office" xmlns:oel="http://schemas.microsoft.com/office/2019/extlst" xmlns:r="http://schemas.openxmlformats.org/officeDocument/2006/relationships" xmlns:m="http://schemas.openxmlformats.org/officeDocument/2006/math" xmlns:v="urn:schemas-microsoft-com:vml" xmlns:wp14="http://schemas.microsoft.com/office/word/2010/wordprocessingDrawing" xmlns:wp="http://schemas.openxmlformats.org/drawingml/2006/wordprocessingDrawing" xmlns:w10="urn:schemas-microsoft-com:office:word" xmlns:w="http://schemas.openxmlformats.org/wordprocessingml/2006/main" xmlns:w14="http://schemas.microsoft.com/office/word/2010/wordml" xmlns:w15="http://schemas.microsoft.com/office/word/2012/wordml" xmlns:w16cex="http://schemas.microsoft.com/office/word/2018/wordml/cex" xmlns:w16cid="http://schemas.microsoft.com/office/word/2016/wordml/cid" xmlns:w16="http://schemas.microsoft.com/office/word/2018/wordml" xmlns:w16sdtdh="http://schemas.microsoft.com/office/word/2020/wordml/sdtdatahash" xmlns:w16se="http://schemas.microsoft.com/office/word/2015/wordml/symex" xmlns:wpg="http://schemas.microsoft.com/office/word/2010/wordprocessingGroup" xmlns:wpi="http://schemas.microsoft.com/office/word/2010/wordprocessingInk" xmlns:wne="http://schemas.microsoft.com/office/word/2006/wordml" xmlns:wps="http://schemas.microsoft.com/office/word/2010/wordprocessingShape" mc:Ignorable="w14 w15 w16se w16cid w16 w16cex w16sdtdh wp14">
+<w:document xmlns:wpc="http://schemas.microsoft.com/office/word/2010/wordprocessingCanvas" xmlns:cx="http://schemas.microsoft.com/office/drawing/2014/chartex" xmlns:cx1="http://schemas.microsoft.com/office/drawing/2015/9/8/chartex" xmlns:cx2="http://schemas.microsoft.com/office/drawing/2015/10/21/chartex" xmlns:cx3="http://schemas.microsoft.com/office/drawing/2016/5/9/chartex" xmlns:cx4="http://schemas.microsoft.com/office/drawing/2016/5/10/chartex" xmlns:cx5="http://schemas.microsoft.com/office/drawing/2016/5/11/chartex" xmlns:cx6="http://schemas.microsoft.com/office/drawing/2016/5/12/chartex" xmlns:cx7="http://schemas.microsoft.com/office/drawing/2016/5/13/chartex" xmlns:cx8="http://schemas.microsoft.com/office/drawing/2016/5/14/chartex" xmlns:mc="http://schemas.openxmlformats.org/markup-compatibility/2006" xmlns:aink="http://schemas.microsoft.com/office/drawing/2016/ink" xmlns:am3d="http://schemas.microsoft.com/office/drawing/2017/model3d" xmlns:o="urn:schemas-microsoft-com:office:office" xmlns:oel="http://schemas.microsoft.com/office/2019/extlst" xmlns:r="http://schemas.openxmlformats.org/officeDocument/2006/relationships" xmlns:m="http://schemas.openxmlformats.org/officeDocument/2006/math" xmlns:v="urn:schemas-microsoft-com:vml" xmlns:wp14="http://schemas.microsoft.com/office/word/2010/wordprocessingDrawing" xmlns:wp="http://schemas.openxmlformats.org/drawingml/2006/wordprocessingDrawing" xmlns:w10="urn:schemas-microsoft-com:office:word" xmlns:w="http://schemas.openxmlformats.org/wordprocessingml/2006/main" xmlns:w14="http://schemas.microsoft.com/office/word/2010/wordml" xmlns:w15="http://schemas.microsoft.com/office/word/2012/wordml" xmlns:w16cex="http://schemas.microsoft.com/office/word/2018/wordml/cex" xmlns:w16cid="http://schemas.microsoft.com/office/word/2016/wordml/cid" xmlns:w16="http://schemas.microsoft.com/office/word/2018/wordml" xmlns:w16du="http://schemas.microsoft.com/office/word/2023/wordml/word16du" xmlns:w16sdtdh="http://schemas.microsoft.com/office/word/2020/wordml/sdtdatahash" xmlns:w16sdtfl="http://schemas.microsoft.com/office/word/2024/wordml/sdtformatlock" xmlns:w16se="http://schemas.microsoft.com/office/word/2015/wordml/symex" xmlns:wpg="http://schemas.microsoft.com/office/word/2010/wordprocessingGroup" xmlns:wpi="http://schemas.microsoft.com/office/word/2010/wordprocessingInk" xmlns:wne="http://schemas.microsoft.com/office/word/2006/wordml" xmlns:wps="http://schemas.microsoft.com/office/word/2010/wordprocessingShape" mc:Ignorable="w14 w15 w16se w16cid w16 w16cex w16sdtdh w16sdtfl w16du wp14">
   <w:body>
+    <w:p>
+      <w:pPr>
+        <w:spacing w:before="0" w:line="240" w:lineRule="auto"/>
+        <w:jc w:val="center"/>
+        <w:rPr>
+          <w:b/>
+          <w:bCs/>
+          <w:sz w:val="32"/>
+          <w:szCs w:val="32"/>
+          <w:u w:val="single"/>
+        </w:rPr>
+      </w:pPr>
+      <w:r>
+        <w:rPr>
+          <w:b/>
+          <w:bCs/>
+          <w:sz w:val="32"/>
+          <w:szCs w:val="32"/>
+          <w:u w:val="single"/>
+        </w:rPr>
+        <w:t xml:space="preserve">TS </w:t>
+      </w:r>
+      <w:r>
+        <w:rPr>
+          <w:b/>
+          <w:bCs/>
+          <w:sz w:val="32"/>
+          <w:szCs w:val="32"/>
+          <w:u w:val="single"/>
+        </w:rPr>
+        <w:t>Ghanam</w:t>
+      </w:r>
+      <w:r>
+        <w:rPr>
+          <w:b/>
+          <w:bCs/>
+          <w:sz w:val="32"/>
+          <w:szCs w:val="32"/>
+          <w:u w:val="single"/>
+        </w:rPr>
+        <w:t xml:space="preserve"> – TS 1.3 Malayalam Corrections – Observed </w:t>
+      </w:r>
+      <w:proofErr w:type="gramStart"/>
+      <w:r>
+        <w:rPr>
+          <w:b/>
+          <w:bCs/>
+          <w:sz w:val="32"/>
+          <w:szCs w:val="32"/>
+          <w:u w:val="single"/>
+        </w:rPr>
+        <w:t xml:space="preserve">till </w:t>
+      </w:r>
+      <w:r>
+        <w:rPr>
+          <w:b/>
+          <w:bCs/>
+          <w:sz w:val="32"/>
+          <w:szCs w:val="32"/>
+          <w:highlight w:val="red"/>
+          <w:u w:val="single"/>
+        </w:rPr>
+        <w:t>????</w:t>
+      </w:r>
+      <w:proofErr w:type="gramEnd"/>
+    </w:p>
+    <w:p>
+      <w:pPr>
+        <w:spacing w:before="0" w:line="240" w:lineRule="auto"/>
+        <w:jc w:val="center"/>
+        <w:rPr>
+          <w:b/>
+          <w:bCs/>
+          <w:sz w:val="28"/>
+          <w:szCs w:val="32"/>
+        </w:rPr>
+      </w:pPr>
+      <w:r>
+        <w:rPr>
+          <w:b/>
+          <w:bCs/>
+          <w:sz w:val="28"/>
+          <w:szCs w:val="32"/>
+        </w:rPr>
+        <w:t>(ignore those which are already incorporated in your book’s version and date)</w:t>
+      </w:r>
+    </w:p>
+    <w:tbl>
+      <w:tblPr>
+        <w:tblW w:w="13970" w:type="dxa"/>
+        <w:tblInd w:w="-792" w:type="dxa"/>
+        <w:tblBorders>
+          <w:top w:val="single" w:sz="4" w:space="0" w:color="000000"/>
+          <w:left w:val="single" w:sz="4" w:space="0" w:color="000000"/>
+          <w:bottom w:val="single" w:sz="4" w:space="0" w:color="000000"/>
+          <w:right w:val="single" w:sz="4" w:space="0" w:color="000000"/>
+          <w:insideH w:val="single" w:sz="4" w:space="0" w:color="000000"/>
+          <w:insideV w:val="single" w:sz="4" w:space="0" w:color="000000"/>
+        </w:tblBorders>
+        <w:tblLook w:val="04A0" w:firstRow="1" w:lastRow="0" w:firstColumn="1" w:lastColumn="0" w:noHBand="0" w:noVBand="1"/>
+      </w:tblPr>
+      <w:tblGrid>
+        <w:gridCol w:w="6883"/>
+        <w:gridCol w:w="7087"/>
+      </w:tblGrid>
+      <w:tr>
+        <w:tc>
+          <w:tcPr>
+            <w:tcW w:w="6883" w:type="dxa"/>
+          </w:tcPr>
+          <w:p>
+            <w:pPr>
+              <w:spacing w:before="0" w:line="240" w:lineRule="auto"/>
+              <w:jc w:val="center"/>
+              <w:rPr>
+                <w:b/>
+                <w:sz w:val="32"/>
+                <w:szCs w:val="32"/>
+              </w:rPr>
+            </w:pPr>
+            <w:r>
+              <w:rPr>
+                <w:b/>
+                <w:sz w:val="32"/>
+                <w:szCs w:val="32"/>
+              </w:rPr>
+              <w:t>As Printed</w:t>
+            </w:r>
+          </w:p>
+        </w:tc>
+        <w:tc>
+          <w:tcPr>
+            <w:tcW w:w="7087" w:type="dxa"/>
+          </w:tcPr>
+          <w:p>
+            <w:pPr>
+              <w:spacing w:before="0" w:line="240" w:lineRule="auto"/>
+              <w:ind w:right="-18"/>
+              <w:jc w:val="center"/>
+              <w:rPr>
+                <w:b/>
+                <w:sz w:val="32"/>
+                <w:szCs w:val="32"/>
+              </w:rPr>
+            </w:pPr>
+            <w:r>
+              <w:rPr>
+                <w:b/>
+                <w:sz w:val="32"/>
+                <w:szCs w:val="32"/>
+              </w:rPr>
+              <w:t>To be read as or corrected as</w:t>
+            </w:r>
+            <w:r>
+              <w:rPr>
+                <w:b/>
+                <w:sz w:val="32"/>
+                <w:szCs w:val="32"/>
+              </w:rPr>
+              <w:t xml:space="preserve"> </w:t>
+            </w:r>
+          </w:p>
+        </w:tc>
+      </w:tr>
+      <w:tr>
+        <w:trPr>
+          <w:trHeight w:val="1338"/>
+        </w:trPr>
+        <w:tc>
+          <w:tcPr>
+            <w:tcW w:w="6883" w:type="dxa"/>
+          </w:tcPr>
+          <w:p>
+            <w:pPr>
+              <w:widowControl w:val="0"/>
+              <w:autoSpaceDE w:val="0"/>
+              <w:autoSpaceDN w:val="0"/>
+              <w:adjustRightInd w:val="0"/>
+              <w:spacing w:before="0" w:line="240" w:lineRule="auto"/>
+              <w:rPr>
+                <w:rFonts w:ascii="BRH Malayalam Extra" w:hAnsi="BRH Malayalam Extra" w:cs="BRH Malayalam Extra"/>
+                <w:color w:val="000000"/>
+                <w:sz w:val="36"/>
+                <w:szCs w:val="40"/>
+              </w:rPr>
+            </w:pPr>
+            <w:r>
+              <w:rPr>
+                <w:rFonts w:cs="BRH Malayalam Extra"/>
+                <w:color w:val="000000"/>
+                <w:sz w:val="28"/>
+                <w:szCs w:val="40"/>
+              </w:rPr>
+              <w:t>5</w:t>
+            </w:r>
+            <w:r>
+              <w:rPr>
+                <w:rFonts w:ascii="BRH Malayalam Extra" w:hAnsi="BRH Malayalam Extra" w:cs="BRH Malayalam Extra"/>
+                <w:color w:val="000000"/>
+                <w:sz w:val="36"/>
+                <w:szCs w:val="40"/>
+              </w:rPr>
+              <w:t xml:space="preserve">)  </w:t>
+            </w:r>
+            <w:r>
+              <w:rPr>
+                <w:rFonts w:cs="BRH Malayalam Extra"/>
+                <w:color w:val="000000"/>
+                <w:sz w:val="28"/>
+                <w:szCs w:val="40"/>
+              </w:rPr>
+              <w:t>1</w:t>
+            </w:r>
+            <w:r>
+              <w:rPr>
+                <w:rFonts w:ascii="BRH Malayalam Extra" w:hAnsi="BRH Malayalam Extra" w:cs="BRH Malayalam Extra"/>
+                <w:color w:val="000000"/>
+                <w:sz w:val="36"/>
+                <w:szCs w:val="40"/>
+              </w:rPr>
+              <w:t>.</w:t>
+            </w:r>
+            <w:r>
+              <w:rPr>
+                <w:rFonts w:cs="BRH Malayalam Extra"/>
+                <w:color w:val="000000"/>
+                <w:sz w:val="28"/>
+                <w:szCs w:val="40"/>
+              </w:rPr>
+              <w:t>3</w:t>
+            </w:r>
+            <w:r>
+              <w:rPr>
+                <w:rFonts w:ascii="BRH Malayalam Extra" w:hAnsi="BRH Malayalam Extra" w:cs="BRH Malayalam Extra"/>
+                <w:color w:val="000000"/>
+                <w:sz w:val="36"/>
+                <w:szCs w:val="40"/>
+              </w:rPr>
+              <w:t>.</w:t>
+            </w:r>
+            <w:r>
+              <w:rPr>
+                <w:rFonts w:cs="BRH Malayalam Extra"/>
+                <w:color w:val="000000"/>
+                <w:sz w:val="28"/>
+                <w:szCs w:val="40"/>
+              </w:rPr>
+              <w:t>14</w:t>
+            </w:r>
+            <w:r>
+              <w:rPr>
+                <w:rFonts w:ascii="BRH Malayalam Extra" w:hAnsi="BRH Malayalam Extra" w:cs="BRH Malayalam Extra"/>
+                <w:color w:val="000000"/>
+                <w:sz w:val="36"/>
+                <w:szCs w:val="40"/>
+              </w:rPr>
+              <w:t>.</w:t>
+            </w:r>
+            <w:r>
+              <w:rPr>
+                <w:rFonts w:cs="BRH Malayalam Extra"/>
+                <w:color w:val="000000"/>
+                <w:sz w:val="28"/>
+                <w:szCs w:val="40"/>
+              </w:rPr>
+              <w:t>4</w:t>
+            </w:r>
+            <w:r>
+              <w:rPr>
+                <w:rFonts w:ascii="BRH Malayalam Extra" w:hAnsi="BRH Malayalam Extra" w:cs="BRH Malayalam Extra"/>
+                <w:color w:val="000000"/>
+                <w:sz w:val="36"/>
+                <w:szCs w:val="40"/>
+              </w:rPr>
+              <w:t>(</w:t>
+            </w:r>
+            <w:r>
+              <w:rPr>
+                <w:rFonts w:cs="BRH Malayalam Extra"/>
+                <w:color w:val="000000"/>
+                <w:sz w:val="28"/>
+                <w:szCs w:val="40"/>
+              </w:rPr>
+              <w:t>3</w:t>
+            </w:r>
+            <w:r>
+              <w:rPr>
+                <w:rFonts w:ascii="BRH Malayalam Extra" w:hAnsi="BRH Malayalam Extra" w:cs="BRH Malayalam Extra"/>
+                <w:color w:val="000000"/>
+                <w:sz w:val="36"/>
+                <w:szCs w:val="40"/>
+              </w:rPr>
+              <w:t>)- k</w:t>
+            </w:r>
+            <w:r>
+              <w:rPr>
+                <w:rFonts w:ascii="BRH Malayalam Extra" w:hAnsi="BRH Malayalam Extra" w:cs="BRH Malayalam Extra"/>
+                <w:color w:val="000000"/>
+                <w:sz w:val="29"/>
+                <w:szCs w:val="40"/>
+              </w:rPr>
+              <w:t>–</w:t>
+            </w:r>
+            <w:r>
+              <w:rPr>
+                <w:rFonts w:ascii="BRH Malayalam Extra" w:hAnsi="BRH Malayalam Extra" w:cs="BRH Malayalam Extra"/>
+                <w:color w:val="000000"/>
+                <w:sz w:val="36"/>
+                <w:szCs w:val="40"/>
+              </w:rPr>
+              <w:t>jyI ||</w:t>
+            </w:r>
+          </w:p>
+          <w:p>
+            <w:pPr>
+              <w:widowControl w:val="0"/>
+              <w:autoSpaceDE w:val="0"/>
+              <w:autoSpaceDN w:val="0"/>
+              <w:adjustRightInd w:val="0"/>
+              <w:spacing w:before="0" w:line="240" w:lineRule="auto"/>
+              <w:rPr>
+                <w:rFonts w:cs="Latha"/>
+                <w:b/>
+                <w:bCs/>
+                <w:sz w:val="32"/>
+                <w:szCs w:val="44"/>
+                <w:cs/>
+                <w:lang w:bidi="ta-IN"/>
+              </w:rPr>
+            </w:pPr>
+            <w:r>
+              <w:rPr>
+                <w:rFonts w:ascii="BRH Malayalam Extra" w:hAnsi="BRH Malayalam Extra" w:cs="BRH Malayalam Extra"/>
+                <w:color w:val="000000"/>
+                <w:sz w:val="36"/>
+                <w:szCs w:val="40"/>
+              </w:rPr>
+              <w:t>k</w:t>
+            </w:r>
+            <w:r>
+              <w:rPr>
+                <w:rFonts w:ascii="BRH Malayalam Extra" w:hAnsi="BRH Malayalam Extra" w:cs="BRH Malayalam Extra"/>
+                <w:color w:val="000000"/>
+                <w:sz w:val="29"/>
+                <w:szCs w:val="40"/>
+              </w:rPr>
+              <w:t>–</w:t>
+            </w:r>
+            <w:r>
+              <w:rPr>
+                <w:rFonts w:ascii="BRH Malayalam Extra" w:hAnsi="BRH Malayalam Extra" w:cs="BRH Malayalam Extra"/>
+                <w:color w:val="000000"/>
+                <w:sz w:val="36"/>
+                <w:szCs w:val="40"/>
+              </w:rPr>
+              <w:t xml:space="preserve">jyiyZy— </w:t>
+            </w:r>
+            <w:r>
+              <w:rPr>
+                <w:rFonts w:ascii="BRH Malayalam Extra" w:hAnsi="BRH Malayalam Extra" w:cs="BRH Malayalam Extra"/>
+                <w:color w:val="000000"/>
+                <w:sz w:val="36"/>
+                <w:szCs w:val="40"/>
+                <w:highlight w:val="yellow"/>
+              </w:rPr>
+              <w:t>k</w:t>
+            </w:r>
+            <w:r>
+              <w:rPr>
+                <w:rFonts w:ascii="BRH Malayalam Extra" w:hAnsi="BRH Malayalam Extra" w:cs="BRH Malayalam Extra"/>
+                <w:color w:val="000000"/>
+                <w:sz w:val="36"/>
+                <w:szCs w:val="40"/>
+              </w:rPr>
+              <w:t xml:space="preserve">jyI | </w:t>
+            </w:r>
+          </w:p>
+        </w:tc>
+        <w:tc>
+          <w:tcPr>
+            <w:tcW w:w="7087" w:type="dxa"/>
+          </w:tcPr>
+          <w:p>
+            <w:pPr>
+              <w:widowControl w:val="0"/>
+              <w:autoSpaceDE w:val="0"/>
+              <w:autoSpaceDN w:val="0"/>
+              <w:adjustRightInd w:val="0"/>
+              <w:spacing w:before="0" w:line="240" w:lineRule="auto"/>
+              <w:rPr>
+                <w:rFonts w:ascii="BRH Malayalam Extra" w:hAnsi="BRH Malayalam Extra" w:cs="BRH Malayalam Extra"/>
+                <w:color w:val="000000"/>
+                <w:sz w:val="36"/>
+                <w:szCs w:val="40"/>
+              </w:rPr>
+            </w:pPr>
+            <w:r>
+              <w:rPr>
+                <w:rFonts w:cs="BRH Malayalam Extra"/>
+                <w:color w:val="000000"/>
+                <w:sz w:val="28"/>
+                <w:szCs w:val="40"/>
+              </w:rPr>
+              <w:t>5</w:t>
+            </w:r>
+            <w:r>
+              <w:rPr>
+                <w:rFonts w:ascii="BRH Malayalam Extra" w:hAnsi="BRH Malayalam Extra" w:cs="BRH Malayalam Extra"/>
+                <w:color w:val="000000"/>
+                <w:sz w:val="36"/>
+                <w:szCs w:val="40"/>
+              </w:rPr>
+              <w:t xml:space="preserve">)  </w:t>
+            </w:r>
+            <w:r>
+              <w:rPr>
+                <w:rFonts w:cs="BRH Malayalam Extra"/>
+                <w:color w:val="000000"/>
+                <w:sz w:val="28"/>
+                <w:szCs w:val="40"/>
+              </w:rPr>
+              <w:t>1</w:t>
+            </w:r>
+            <w:r>
+              <w:rPr>
+                <w:rFonts w:ascii="BRH Malayalam Extra" w:hAnsi="BRH Malayalam Extra" w:cs="BRH Malayalam Extra"/>
+                <w:color w:val="000000"/>
+                <w:sz w:val="36"/>
+                <w:szCs w:val="40"/>
+              </w:rPr>
+              <w:t>.</w:t>
+            </w:r>
+            <w:r>
+              <w:rPr>
+                <w:rFonts w:cs="BRH Malayalam Extra"/>
+                <w:color w:val="000000"/>
+                <w:sz w:val="28"/>
+                <w:szCs w:val="40"/>
+              </w:rPr>
+              <w:t>3</w:t>
+            </w:r>
+            <w:r>
+              <w:rPr>
+                <w:rFonts w:ascii="BRH Malayalam Extra" w:hAnsi="BRH Malayalam Extra" w:cs="BRH Malayalam Extra"/>
+                <w:color w:val="000000"/>
+                <w:sz w:val="36"/>
+                <w:szCs w:val="40"/>
+              </w:rPr>
+              <w:t>.</w:t>
+            </w:r>
+            <w:r>
+              <w:rPr>
+                <w:rFonts w:cs="BRH Malayalam Extra"/>
+                <w:color w:val="000000"/>
+                <w:sz w:val="28"/>
+                <w:szCs w:val="40"/>
+              </w:rPr>
+              <w:t>14</w:t>
+            </w:r>
+            <w:r>
+              <w:rPr>
+                <w:rFonts w:ascii="BRH Malayalam Extra" w:hAnsi="BRH Malayalam Extra" w:cs="BRH Malayalam Extra"/>
+                <w:color w:val="000000"/>
+                <w:sz w:val="36"/>
+                <w:szCs w:val="40"/>
+              </w:rPr>
+              <w:t>.</w:t>
+            </w:r>
+            <w:r>
+              <w:rPr>
+                <w:rFonts w:cs="BRH Malayalam Extra"/>
+                <w:color w:val="000000"/>
+                <w:sz w:val="28"/>
+                <w:szCs w:val="40"/>
+              </w:rPr>
+              <w:t>4</w:t>
+            </w:r>
+            <w:r>
+              <w:rPr>
+                <w:rFonts w:ascii="BRH Malayalam Extra" w:hAnsi="BRH Malayalam Extra" w:cs="BRH Malayalam Extra"/>
+                <w:color w:val="000000"/>
+                <w:sz w:val="36"/>
+                <w:szCs w:val="40"/>
+              </w:rPr>
+              <w:t>(</w:t>
+            </w:r>
+            <w:r>
+              <w:rPr>
+                <w:rFonts w:cs="BRH Malayalam Extra"/>
+                <w:color w:val="000000"/>
+                <w:sz w:val="28"/>
+                <w:szCs w:val="40"/>
+              </w:rPr>
+              <w:t>3</w:t>
+            </w:r>
+            <w:r>
+              <w:rPr>
+                <w:rFonts w:ascii="BRH Malayalam Extra" w:hAnsi="BRH Malayalam Extra" w:cs="BRH Malayalam Extra"/>
+                <w:color w:val="000000"/>
+                <w:sz w:val="36"/>
+                <w:szCs w:val="40"/>
+              </w:rPr>
+              <w:t>)- k</w:t>
+            </w:r>
+            <w:r>
+              <w:rPr>
+                <w:rFonts w:ascii="BRH Malayalam Extra" w:hAnsi="BRH Malayalam Extra" w:cs="BRH Malayalam Extra"/>
+                <w:color w:val="000000"/>
+                <w:sz w:val="29"/>
+                <w:szCs w:val="40"/>
+              </w:rPr>
+              <w:t>–</w:t>
+            </w:r>
+            <w:r>
+              <w:rPr>
+                <w:rFonts w:ascii="BRH Malayalam Extra" w:hAnsi="BRH Malayalam Extra" w:cs="BRH Malayalam Extra"/>
+                <w:color w:val="000000"/>
+                <w:sz w:val="36"/>
+                <w:szCs w:val="40"/>
+              </w:rPr>
+              <w:t>jyI ||</w:t>
+            </w:r>
+          </w:p>
+          <w:p>
+            <w:pPr>
+              <w:widowControl w:val="0"/>
+              <w:autoSpaceDE w:val="0"/>
+              <w:autoSpaceDN w:val="0"/>
+              <w:adjustRightInd w:val="0"/>
+              <w:spacing w:before="0" w:line="240" w:lineRule="auto"/>
+              <w:rPr>
+                <w:rFonts w:cs="Latha"/>
+                <w:b/>
+                <w:bCs/>
+                <w:sz w:val="32"/>
+                <w:szCs w:val="44"/>
+                <w:cs/>
+                <w:lang w:bidi="ta-IN"/>
+              </w:rPr>
+            </w:pPr>
+            <w:r>
+              <w:rPr>
+                <w:rFonts w:ascii="BRH Malayalam Extra" w:hAnsi="BRH Malayalam Extra" w:cs="BRH Malayalam Extra"/>
+                <w:color w:val="000000"/>
+                <w:sz w:val="36"/>
+                <w:szCs w:val="40"/>
+              </w:rPr>
+              <w:t>k</w:t>
+            </w:r>
+            <w:r>
+              <w:rPr>
+                <w:rFonts w:ascii="BRH Malayalam Extra" w:hAnsi="BRH Malayalam Extra" w:cs="BRH Malayalam Extra"/>
+                <w:color w:val="000000"/>
+                <w:sz w:val="29"/>
+                <w:szCs w:val="40"/>
+              </w:rPr>
+              <w:t>–</w:t>
+            </w:r>
+            <w:r>
+              <w:rPr>
+                <w:rFonts w:ascii="BRH Malayalam Extra" w:hAnsi="BRH Malayalam Extra" w:cs="BRH Malayalam Extra"/>
+                <w:color w:val="000000"/>
+                <w:sz w:val="36"/>
+                <w:szCs w:val="40"/>
+              </w:rPr>
+              <w:t xml:space="preserve">jyiyZy— </w:t>
+            </w:r>
+            <w:r>
+              <w:rPr>
+                <w:rFonts w:ascii="BRH Malayalam Extra" w:hAnsi="BRH Malayalam Extra" w:cs="BRH Malayalam Extra"/>
+                <w:color w:val="000000"/>
+                <w:sz w:val="36"/>
+                <w:szCs w:val="40"/>
+                <w:highlight w:val="green"/>
+              </w:rPr>
+              <w:t>k</w:t>
+            </w:r>
+            <w:r>
+              <w:rPr>
+                <w:rFonts w:ascii="BRH Malayalam Extra" w:hAnsi="BRH Malayalam Extra" w:cs="BRH Malayalam Extra"/>
+                <w:color w:val="000000"/>
+                <w:sz w:val="29"/>
+                <w:szCs w:val="40"/>
+              </w:rPr>
+              <w:t>–</w:t>
+            </w:r>
+            <w:r>
+              <w:rPr>
+                <w:rFonts w:ascii="BRH Malayalam Extra" w:hAnsi="BRH Malayalam Extra" w:cs="BRH Malayalam Extra"/>
+                <w:color w:val="000000"/>
+                <w:sz w:val="36"/>
+                <w:szCs w:val="40"/>
+              </w:rPr>
+              <w:t xml:space="preserve">jyI | </w:t>
+            </w:r>
+          </w:p>
+        </w:tc>
+      </w:tr>
+    </w:tbl>
+    <w:p>
+      <w:pPr>
+        <w:spacing w:before="0" w:line="240" w:lineRule="auto"/>
+        <w:jc w:val="center"/>
+        <w:rPr>
+          <w:b/>
+          <w:bCs/>
+          <w:sz w:val="32"/>
+          <w:szCs w:val="32"/>
+          <w:u w:val="single"/>
+        </w:rPr>
+      </w:pPr>
+    </w:p>
+    <w:p>
+      <w:pPr>
+        <w:spacing w:before="0" w:line="240" w:lineRule="auto"/>
+        <w:jc w:val="center"/>
+        <w:rPr>
+          <w:b/>
+          <w:bCs/>
+          <w:sz w:val="32"/>
+          <w:szCs w:val="32"/>
+          <w:u w:val="single"/>
+        </w:rPr>
+      </w:pPr>
+    </w:p>
     <w:p>
       <w:pPr>
         <w:spacing w:before="0" w:line="240" w:lineRule="auto"/>
@@ -93,27 +718,7 @@
           <w:sz w:val="28"/>
           <w:szCs w:val="32"/>
         </w:rPr>
-        <w:t>(</w:t>
-      </w:r>
-      <w:proofErr w:type="gramStart"/>
-      <w:r>
-        <w:rPr>
-          <w:b/>
-          <w:bCs/>
-          <w:sz w:val="28"/>
-          <w:szCs w:val="32"/>
-        </w:rPr>
-        <w:t>ignore</w:t>
-      </w:r>
-      <w:proofErr w:type="gramEnd"/>
-      <w:r>
-        <w:rPr>
-          <w:b/>
-          <w:bCs/>
-          <w:sz w:val="28"/>
-          <w:szCs w:val="32"/>
-        </w:rPr>
-        <w:t xml:space="preserve"> those which are already incorporated in your book’s version and date)</w:t>
+        <w:t>(ignore those which are already incorporated in your book’s version and date)</w:t>
       </w:r>
     </w:p>
     <w:tbl>
@@ -1060,6 +1665,7 @@
                 <w:cs/>
                 <w:lang w:bidi="ta-IN"/>
               </w:rPr>
+              <w:lastRenderedPageBreak/>
               <w:t>1.3.2.2</w:t>
             </w:r>
             <w:r>
@@ -2858,7 +3464,25 @@
                 <w:sz w:val="32"/>
                 <w:szCs w:val="40"/>
               </w:rPr>
-              <w:t xml:space="preserve">— ty(³§)szJ | </w:t>
+              <w:t>— ty(³</w:t>
+            </w:r>
+            <w:proofErr w:type="gramStart"/>
+            <w:r>
+              <w:rPr>
+                <w:rFonts w:ascii="BRH Malayalam Extra" w:hAnsi="BRH Malayalam Extra" w:cs="BRH Malayalam Extra"/>
+                <w:sz w:val="32"/>
+                <w:szCs w:val="40"/>
+              </w:rPr>
+              <w:t>§)szJ</w:t>
+            </w:r>
+            <w:proofErr w:type="gramEnd"/>
+            <w:r>
+              <w:rPr>
+                <w:rFonts w:ascii="BRH Malayalam Extra" w:hAnsi="BRH Malayalam Extra" w:cs="BRH Malayalam Extra"/>
+                <w:sz w:val="32"/>
+                <w:szCs w:val="40"/>
+              </w:rPr>
+              <w:t xml:space="preserve"> | </w:t>
             </w:r>
           </w:p>
         </w:tc>
@@ -3108,7 +3732,25 @@
                 <w:sz w:val="32"/>
                 <w:szCs w:val="40"/>
               </w:rPr>
-              <w:t xml:space="preserve">— ty(³§)szJ | </w:t>
+              <w:t>— ty(³</w:t>
+            </w:r>
+            <w:proofErr w:type="gramStart"/>
+            <w:r>
+              <w:rPr>
+                <w:rFonts w:ascii="BRH Malayalam Extra" w:hAnsi="BRH Malayalam Extra" w:cs="BRH Malayalam Extra"/>
+                <w:sz w:val="32"/>
+                <w:szCs w:val="40"/>
+              </w:rPr>
+              <w:t>§)szJ</w:t>
+            </w:r>
+            <w:proofErr w:type="gramEnd"/>
+            <w:r>
+              <w:rPr>
+                <w:rFonts w:ascii="BRH Malayalam Extra" w:hAnsi="BRH Malayalam Extra" w:cs="BRH Malayalam Extra"/>
+                <w:sz w:val="32"/>
+                <w:szCs w:val="40"/>
+              </w:rPr>
+              <w:t xml:space="preserve"> | </w:t>
             </w:r>
           </w:p>
           <w:p>
@@ -3151,7 +3793,6 @@
                 <w:szCs w:val="40"/>
                 <w:lang w:val="it-IT"/>
               </w:rPr>
-              <w:lastRenderedPageBreak/>
               <w:t>41</w:t>
             </w:r>
             <w:r>
@@ -4767,6 +5408,7 @@
                 <w:szCs w:val="40"/>
                 <w:lang w:val="it-IT"/>
               </w:rPr>
+              <w:lastRenderedPageBreak/>
               <w:t>13</w:t>
             </w:r>
             <w:r>
@@ -6773,7 +7415,6 @@
                 <w:rFonts w:cs="BRH Malayalam Extra"/>
                 <w:szCs w:val="40"/>
               </w:rPr>
-              <w:lastRenderedPageBreak/>
               <w:t>23</w:t>
             </w:r>
             <w:r>
@@ -7655,6 +8296,7 @@
                 <w:sz w:val="32"/>
                 <w:szCs w:val="40"/>
               </w:rPr>
+              <w:lastRenderedPageBreak/>
               <w:t>¥kp</w:t>
             </w:r>
             <w:r>
@@ -8437,7 +9079,6 @@
                 <w:rFonts w:cs="BRH Malayalam Extra"/>
                 <w:szCs w:val="40"/>
               </w:rPr>
-              <w:lastRenderedPageBreak/>
               <w:t>23</w:t>
             </w:r>
             <w:r>
@@ -9339,6 +9980,7 @@
                 <w:sz w:val="32"/>
                 <w:szCs w:val="40"/>
               </w:rPr>
+              <w:lastRenderedPageBreak/>
               <w:t>¥kp</w:t>
             </w:r>
             <w:r>
@@ -10491,7 +11133,6 @@
                 <w:rFonts w:cs="BRH Malayalam Extra"/>
                 <w:szCs w:val="40"/>
               </w:rPr>
-              <w:lastRenderedPageBreak/>
               <w:t>25</w:t>
             </w:r>
             <w:r>
@@ -12256,6 +12897,7 @@
                 <w:sz w:val="32"/>
                 <w:szCs w:val="40"/>
               </w:rPr>
+              <w:lastRenderedPageBreak/>
               <w:t>¥Z</w:t>
             </w:r>
             <w:r>
@@ -13373,6 +14015,7 @@
                 <w:sz w:val="32"/>
                 <w:szCs w:val="40"/>
               </w:rPr>
+              <w:lastRenderedPageBreak/>
               <w:t>¥Z</w:t>
             </w:r>
             <w:r>
@@ -15225,7 +15868,34 @@
                 <w:sz w:val="32"/>
                 <w:szCs w:val="40"/>
               </w:rPr>
-              <w:t>) k±—sx(³§) ty(³§)sz ¥kd ¥id(³§) ty(³§)</w:t>
+              <w:t>) k±—sx(³§) ty(³</w:t>
+            </w:r>
+            <w:proofErr w:type="gramStart"/>
+            <w:r>
+              <w:rPr>
+                <w:rFonts w:ascii="BRH Malayalam Extra" w:hAnsi="BRH Malayalam Extra" w:cs="BRH Malayalam Extra"/>
+                <w:sz w:val="32"/>
+                <w:szCs w:val="40"/>
+              </w:rPr>
+              <w:t>§)sz</w:t>
+            </w:r>
+            <w:proofErr w:type="gramEnd"/>
+            <w:r>
+              <w:rPr>
+                <w:rFonts w:ascii="BRH Malayalam Extra" w:hAnsi="BRH Malayalam Extra" w:cs="BRH Malayalam Extra"/>
+                <w:sz w:val="32"/>
+                <w:szCs w:val="40"/>
+              </w:rPr>
+              <w:t xml:space="preserve"> ¥kd ¥id(³§) ty(³</w:t>
+            </w:r>
+            <w:proofErr w:type="gramStart"/>
+            <w:r>
+              <w:rPr>
+                <w:rFonts w:ascii="BRH Malayalam Extra" w:hAnsi="BRH Malayalam Extra" w:cs="BRH Malayalam Extra"/>
+                <w:sz w:val="32"/>
+                <w:szCs w:val="40"/>
+              </w:rPr>
+              <w:t>§)</w:t>
             </w:r>
             <w:r>
               <w:rPr>
@@ -15236,6 +15906,7 @@
               </w:rPr>
               <w:t>sz</w:t>
             </w:r>
+            <w:proofErr w:type="gramEnd"/>
             <w:r>
               <w:rPr>
                 <w:rFonts w:ascii="BRH Malayalam Extra" w:hAnsi="BRH Malayalam Extra" w:cs="BRH Malayalam Extra"/>
@@ -15469,6 +16140,7 @@
                 <w:sz w:val="32"/>
                 <w:szCs w:val="40"/>
               </w:rPr>
+              <w:lastRenderedPageBreak/>
               <w:t>ty</w:t>
             </w:r>
             <w:r>
@@ -15704,7 +16376,25 @@
                 <w:sz w:val="32"/>
                 <w:szCs w:val="40"/>
               </w:rPr>
-              <w:t>¥Mx k±—sx(³§) ty(³§)szª. ty(³</w:t>
+              <w:t>¥Mx k±—sx(³§) ty(³</w:t>
+            </w:r>
+            <w:proofErr w:type="gramStart"/>
+            <w:r>
+              <w:rPr>
+                <w:rFonts w:ascii="BRH Malayalam Extra" w:hAnsi="BRH Malayalam Extra" w:cs="BRH Malayalam Extra"/>
+                <w:sz w:val="32"/>
+                <w:szCs w:val="40"/>
+              </w:rPr>
+              <w:t>§)szª</w:t>
+            </w:r>
+            <w:proofErr w:type="gramEnd"/>
+            <w:r>
+              <w:rPr>
+                <w:rFonts w:ascii="BRH Malayalam Extra" w:hAnsi="BRH Malayalam Extra" w:cs="BRH Malayalam Extra"/>
+                <w:sz w:val="32"/>
+                <w:szCs w:val="40"/>
+              </w:rPr>
+              <w:t>. ty(³</w:t>
             </w:r>
             <w:proofErr w:type="gramStart"/>
             <w:r>
@@ -15807,6 +16497,7 @@
                 <w:rFonts w:cs="BRH Malayalam Extra"/>
                 <w:szCs w:val="40"/>
               </w:rPr>
+              <w:lastRenderedPageBreak/>
               <w:t>15</w:t>
             </w:r>
             <w:r>
@@ -16561,6 +17252,7 @@
                 <w:sz w:val="32"/>
                 <w:szCs w:val="40"/>
               </w:rPr>
+              <w:lastRenderedPageBreak/>
               <w:t>ty</w:t>
             </w:r>
             <w:r>
@@ -16760,7 +17452,25 @@
                 <w:sz w:val="32"/>
                 <w:szCs w:val="40"/>
               </w:rPr>
-              <w:t>¥Mx k±—sx(³§) ty(³§)szª. ty(³</w:t>
+              <w:t>¥Mx k±—sx(³§) ty(³</w:t>
+            </w:r>
+            <w:proofErr w:type="gramStart"/>
+            <w:r>
+              <w:rPr>
+                <w:rFonts w:ascii="BRH Malayalam Extra" w:hAnsi="BRH Malayalam Extra" w:cs="BRH Malayalam Extra"/>
+                <w:sz w:val="32"/>
+                <w:szCs w:val="40"/>
+              </w:rPr>
+              <w:t>§)szª</w:t>
+            </w:r>
+            <w:proofErr w:type="gramEnd"/>
+            <w:r>
+              <w:rPr>
+                <w:rFonts w:ascii="BRH Malayalam Extra" w:hAnsi="BRH Malayalam Extra" w:cs="BRH Malayalam Extra"/>
+                <w:sz w:val="32"/>
+                <w:szCs w:val="40"/>
+              </w:rPr>
+              <w:t>. ty(³</w:t>
             </w:r>
             <w:proofErr w:type="gramStart"/>
             <w:r>
@@ -16864,6 +17574,7 @@
                 <w:rFonts w:cs="BRH Malayalam Extra"/>
                 <w:szCs w:val="40"/>
               </w:rPr>
+              <w:lastRenderedPageBreak/>
               <w:t>12</w:t>
             </w:r>
             <w:r>
@@ -17247,7 +17958,6 @@
                 <w:rFonts w:cs="BRH Malayalam Extra"/>
                 <w:szCs w:val="40"/>
               </w:rPr>
-              <w:lastRenderedPageBreak/>
               <w:t>13</w:t>
             </w:r>
             <w:r>
@@ -17642,7 +18352,6 @@
                 <w:rFonts w:cs="BRH Malayalam Extra"/>
                 <w:szCs w:val="40"/>
               </w:rPr>
-              <w:lastRenderedPageBreak/>
               <w:t>12</w:t>
             </w:r>
             <w:r>
@@ -18026,7 +18735,6 @@
                 <w:rFonts w:cs="BRH Malayalam Extra"/>
                 <w:szCs w:val="40"/>
               </w:rPr>
-              <w:lastRenderedPageBreak/>
               <w:t>13</w:t>
             </w:r>
             <w:r>
@@ -18423,7 +19131,6 @@
                 <w:rFonts w:cs="BRH Malayalam Extra"/>
                 <w:szCs w:val="40"/>
               </w:rPr>
-              <w:lastRenderedPageBreak/>
               <w:t>52</w:t>
             </w:r>
             <w:r>
@@ -18750,6 +19457,7 @@
                 <w:rFonts w:cs="BRH Malayalam Extra"/>
                 <w:szCs w:val="40"/>
               </w:rPr>
+              <w:lastRenderedPageBreak/>
               <w:t>53</w:t>
             </w:r>
             <w:r>
@@ -19379,6 +20087,7 @@
                 <w:rFonts w:cs="BRH Malayalam Extra"/>
                 <w:szCs w:val="40"/>
               </w:rPr>
+              <w:lastRenderedPageBreak/>
               <w:t>52</w:t>
             </w:r>
             <w:r>
@@ -19705,6 +20414,7 @@
                 <w:rFonts w:cs="BRH Malayalam Extra"/>
                 <w:szCs w:val="40"/>
               </w:rPr>
+              <w:lastRenderedPageBreak/>
               <w:t>53</w:t>
             </w:r>
             <w:r>
@@ -20387,6 +21097,7 @@
                 <w:rFonts w:cs="BRH Malayalam Extra"/>
                 <w:szCs w:val="40"/>
               </w:rPr>
+              <w:lastRenderedPageBreak/>
               <w:t>82</w:t>
             </w:r>
             <w:r>
@@ -20808,7 +21519,6 @@
                 <w:rFonts w:cs="BRH Malayalam Extra"/>
                 <w:szCs w:val="40"/>
               </w:rPr>
-              <w:lastRenderedPageBreak/>
               <w:t>12</w:t>
             </w:r>
             <w:r>
@@ -21702,7 +22412,16 @@
                 <w:sz w:val="32"/>
                 <w:szCs w:val="40"/>
               </w:rPr>
-              <w:t xml:space="preserve"> exp—¥kxtÇ¡ q£</w:t>
+              <w:t xml:space="preserve"> </w:t>
+            </w:r>
+            <w:r>
+              <w:rPr>
+                <w:rFonts w:ascii="BRH Malayalam Extra" w:hAnsi="BRH Malayalam Extra" w:cs="BRH Malayalam Extra"/>
+                <w:sz w:val="32"/>
+                <w:szCs w:val="40"/>
+              </w:rPr>
+              <w:lastRenderedPageBreak/>
+              <w:t>exp—¥kxtÇ¡ q£</w:t>
             </w:r>
             <w:r>
               <w:rPr>
@@ -21894,6 +22613,7 @@
                 <w:rFonts w:cs="BRH Malayalam Extra"/>
                 <w:szCs w:val="40"/>
               </w:rPr>
+              <w:lastRenderedPageBreak/>
               <w:t>38</w:t>
             </w:r>
             <w:r>
@@ -22481,7 +23201,16 @@
                 <w:sz w:val="32"/>
                 <w:szCs w:val="40"/>
               </w:rPr>
-              <w:t xml:space="preserve"> exp—¥kxtÇ¡ q£</w:t>
+              <w:t xml:space="preserve"> </w:t>
+            </w:r>
+            <w:r>
+              <w:rPr>
+                <w:rFonts w:ascii="BRH Malayalam Extra" w:hAnsi="BRH Malayalam Extra" w:cs="BRH Malayalam Extra"/>
+                <w:sz w:val="32"/>
+                <w:szCs w:val="40"/>
+              </w:rPr>
+              <w:lastRenderedPageBreak/>
+              <w:t>exp—¥kxtÇ¡ q£</w:t>
             </w:r>
             <w:r>
               <w:rPr>
@@ -22684,6 +23413,7 @@
                 <w:rFonts w:cs="BRH Malayalam Extra"/>
                 <w:szCs w:val="40"/>
               </w:rPr>
+              <w:lastRenderedPageBreak/>
               <w:t>30</w:t>
             </w:r>
             <w:r>
@@ -23195,7 +23925,6 @@
                 <w:rFonts w:cs="BRH Malayalam Extra"/>
                 <w:szCs w:val="40"/>
               </w:rPr>
-              <w:lastRenderedPageBreak/>
               <w:t>31</w:t>
             </w:r>
             <w:r>
@@ -23541,7 +24270,6 @@
                 <w:cs/>
                 <w:lang w:bidi="ta-IN"/>
               </w:rPr>
-              <w:lastRenderedPageBreak/>
               <w:t>1</w:t>
             </w:r>
             <w:r>
@@ -24050,7 +24778,6 @@
                 <w:rFonts w:cs="BRH Malayalam Extra"/>
                 <w:szCs w:val="40"/>
               </w:rPr>
-              <w:lastRenderedPageBreak/>
               <w:t>31</w:t>
             </w:r>
             <w:r>
@@ -24377,7 +25104,6 @@
                 <w:rFonts w:cs="BRH Malayalam Extra"/>
                 <w:szCs w:val="40"/>
               </w:rPr>
-              <w:lastRenderedPageBreak/>
               <w:t>56</w:t>
             </w:r>
             <w:r>
@@ -25094,7 +25820,16 @@
                 <w:sz w:val="32"/>
                 <w:szCs w:val="40"/>
               </w:rPr>
-              <w:t xml:space="preserve"> „„sx „hy P—ª.r</w:t>
+              <w:t xml:space="preserve"> „„sx </w:t>
+            </w:r>
+            <w:r>
+              <w:rPr>
+                <w:rFonts w:ascii="BRH Malayalam Extra" w:hAnsi="BRH Malayalam Extra" w:cs="BRH Malayalam Extra"/>
+                <w:sz w:val="32"/>
+                <w:szCs w:val="40"/>
+              </w:rPr>
+              <w:lastRenderedPageBreak/>
+              <w:t>„hy P—ª.r</w:t>
             </w:r>
             <w:r>
               <w:rPr>
@@ -25364,21 +26099,31 @@
               </w:rPr>
               <w:t>1</w:t>
             </w:r>
-            <w:r>
-              <w:rPr>
-                <w:rFonts w:ascii="BRH Malayalam Extra" w:hAnsi="BRH Malayalam Extra" w:cs="BRH Malayalam Extra"/>
-                <w:sz w:val="25"/>
-                <w:szCs w:val="40"/>
-              </w:rPr>
-              <w:t>–</w:t>
-            </w:r>
-            <w:r>
-              <w:rPr>
-                <w:rFonts w:ascii="BRH Malayalam Extra" w:hAnsi="BRH Malayalam Extra" w:cs="BRH Malayalam Extra"/>
-                <w:sz w:val="32"/>
-                <w:szCs w:val="40"/>
-              </w:rPr>
-              <w:t>)hõx—sx px¥R—r¡</w:t>
+            <w:proofErr w:type="gramStart"/>
+            <w:r>
+              <w:rPr>
+                <w:rFonts w:ascii="BRH Malayalam Extra" w:hAnsi="BRH Malayalam Extra" w:cs="BRH Malayalam Extra"/>
+                <w:sz w:val="25"/>
+                <w:szCs w:val="40"/>
+              </w:rPr>
+              <w:t>–</w:t>
+            </w:r>
+            <w:r>
+              <w:rPr>
+                <w:rFonts w:ascii="BRH Malayalam Extra" w:hAnsi="BRH Malayalam Extra" w:cs="BRH Malayalam Extra"/>
+                <w:sz w:val="32"/>
+                <w:szCs w:val="40"/>
+              </w:rPr>
+              <w:t>)hõx</w:t>
+            </w:r>
+            <w:proofErr w:type="gramEnd"/>
+            <w:r>
+              <w:rPr>
+                <w:rFonts w:ascii="BRH Malayalam Extra" w:hAnsi="BRH Malayalam Extra" w:cs="BRH Malayalam Extra"/>
+                <w:sz w:val="32"/>
+                <w:szCs w:val="40"/>
+              </w:rPr>
+              <w:t>—sx px¥R—r¡</w:t>
             </w:r>
             <w:r>
               <w:rPr>
@@ -25410,8 +26155,18 @@
                 <w:sz w:val="32"/>
                 <w:szCs w:val="40"/>
               </w:rPr>
-              <w:t>sx „hõx˜(</w:t>
-            </w:r>
+              <w:t>sx „hõx</w:t>
+            </w:r>
+            <w:proofErr w:type="gramStart"/>
+            <w:r>
+              <w:rPr>
+                <w:rFonts w:ascii="BRH Malayalam Extra" w:hAnsi="BRH Malayalam Extra" w:cs="BRH Malayalam Extra"/>
+                <w:sz w:val="32"/>
+                <w:szCs w:val="40"/>
+              </w:rPr>
+              <w:t>˜(</w:t>
+            </w:r>
+            <w:proofErr w:type="gramEnd"/>
             <w:r>
               <w:rPr>
                 <w:rFonts w:cs="BRH Malayalam Extra"/>
@@ -25419,21 +26174,31 @@
               </w:rPr>
               <w:t>1</w:t>
             </w:r>
-            <w:r>
-              <w:rPr>
-                <w:rFonts w:ascii="BRH Malayalam Extra" w:hAnsi="BRH Malayalam Extra" w:cs="BRH Malayalam Extra"/>
-                <w:sz w:val="25"/>
-                <w:szCs w:val="40"/>
-              </w:rPr>
-              <w:t>–</w:t>
-            </w:r>
-            <w:r>
-              <w:rPr>
-                <w:rFonts w:ascii="BRH Malayalam Extra" w:hAnsi="BRH Malayalam Extra" w:cs="BRH Malayalam Extra"/>
-                <w:sz w:val="32"/>
-                <w:szCs w:val="40"/>
-              </w:rPr>
-              <w:t xml:space="preserve">)hõx—sx px¥R—r¡ | </w:t>
+            <w:proofErr w:type="gramStart"/>
+            <w:r>
+              <w:rPr>
+                <w:rFonts w:ascii="BRH Malayalam Extra" w:hAnsi="BRH Malayalam Extra" w:cs="BRH Malayalam Extra"/>
+                <w:sz w:val="25"/>
+                <w:szCs w:val="40"/>
+              </w:rPr>
+              <w:t>–</w:t>
+            </w:r>
+            <w:r>
+              <w:rPr>
+                <w:rFonts w:ascii="BRH Malayalam Extra" w:hAnsi="BRH Malayalam Extra" w:cs="BRH Malayalam Extra"/>
+                <w:sz w:val="32"/>
+                <w:szCs w:val="40"/>
+              </w:rPr>
+              <w:t>)hõx</w:t>
+            </w:r>
+            <w:proofErr w:type="gramEnd"/>
+            <w:r>
+              <w:rPr>
+                <w:rFonts w:ascii="BRH Malayalam Extra" w:hAnsi="BRH Malayalam Extra" w:cs="BRH Malayalam Extra"/>
+                <w:sz w:val="32"/>
+                <w:szCs w:val="40"/>
+              </w:rPr>
+              <w:t xml:space="preserve">—sx px¥R—r¡ | </w:t>
             </w:r>
           </w:p>
         </w:tc>
@@ -25459,6 +26224,7 @@
                 <w:rFonts w:cs="BRH Malayalam Extra"/>
                 <w:szCs w:val="40"/>
               </w:rPr>
+              <w:lastRenderedPageBreak/>
               <w:t>1</w:t>
             </w:r>
             <w:r>
@@ -25712,24 +26478,44 @@
                 <w:sz w:val="32"/>
                 <w:szCs w:val="40"/>
               </w:rPr>
-              <w:t>hõ—hy P—ª.r</w:t>
-            </w:r>
-            <w:r>
-              <w:rPr>
-                <w:rFonts w:ascii="BRH Malayalam Extra" w:hAnsi="BRH Malayalam Extra" w:cs="BRH Malayalam Extra"/>
-                <w:sz w:val="25"/>
-                <w:szCs w:val="40"/>
-              </w:rPr>
-              <w:t>–</w:t>
-            </w:r>
-            <w:r>
-              <w:rPr>
-                <w:rFonts w:ascii="BRH Malayalam Extra" w:hAnsi="BRH Malayalam Extra" w:cs="BRH Malayalam Extra"/>
-                <w:sz w:val="32"/>
-                <w:szCs w:val="40"/>
-              </w:rPr>
-              <w:t>Yz Ò—ª.r</w:t>
-            </w:r>
+              <w:t>hõ—hy P—</w:t>
+            </w:r>
+            <w:proofErr w:type="gramStart"/>
+            <w:r>
+              <w:rPr>
+                <w:rFonts w:ascii="BRH Malayalam Extra" w:hAnsi="BRH Malayalam Extra" w:cs="BRH Malayalam Extra"/>
+                <w:sz w:val="32"/>
+                <w:szCs w:val="40"/>
+              </w:rPr>
+              <w:t>ª.r</w:t>
+            </w:r>
+            <w:proofErr w:type="gramEnd"/>
+            <w:r>
+              <w:rPr>
+                <w:rFonts w:ascii="BRH Malayalam Extra" w:hAnsi="BRH Malayalam Extra" w:cs="BRH Malayalam Extra"/>
+                <w:sz w:val="25"/>
+                <w:szCs w:val="40"/>
+              </w:rPr>
+              <w:t>–</w:t>
+            </w:r>
+            <w:r>
+              <w:rPr>
+                <w:rFonts w:ascii="BRH Malayalam Extra" w:hAnsi="BRH Malayalam Extra" w:cs="BRH Malayalam Extra"/>
+                <w:sz w:val="32"/>
+                <w:szCs w:val="40"/>
+              </w:rPr>
+              <w:t>Yz Ò—</w:t>
+            </w:r>
+            <w:proofErr w:type="gramStart"/>
+            <w:r>
+              <w:rPr>
+                <w:rFonts w:ascii="BRH Malayalam Extra" w:hAnsi="BRH Malayalam Extra" w:cs="BRH Malayalam Extra"/>
+                <w:sz w:val="32"/>
+                <w:szCs w:val="40"/>
+              </w:rPr>
+              <w:t>ª.r</w:t>
+            </w:r>
+            <w:proofErr w:type="gramEnd"/>
             <w:r>
               <w:rPr>
                 <w:rFonts w:ascii="BRH Malayalam Extra" w:hAnsi="BRH Malayalam Extra" w:cs="BRH Malayalam Extra"/>
@@ -25777,24 +26563,53 @@
                 <w:sz w:val="32"/>
                 <w:szCs w:val="40"/>
               </w:rPr>
-              <w:t xml:space="preserve"> „„sx „hy P—ª.r</w:t>
-            </w:r>
-            <w:r>
-              <w:rPr>
-                <w:rFonts w:ascii="BRH Malayalam Extra" w:hAnsi="BRH Malayalam Extra" w:cs="BRH Malayalam Extra"/>
-                <w:sz w:val="25"/>
-                <w:szCs w:val="40"/>
-              </w:rPr>
-              <w:t>–</w:t>
-            </w:r>
-            <w:r>
-              <w:rPr>
-                <w:rFonts w:ascii="BRH Malayalam Extra" w:hAnsi="BRH Malayalam Extra" w:cs="BRH Malayalam Extra"/>
-                <w:sz w:val="32"/>
-                <w:szCs w:val="40"/>
-              </w:rPr>
-              <w:t>Yz Ò—ª.r</w:t>
-            </w:r>
+              <w:t xml:space="preserve"> </w:t>
+            </w:r>
+            <w:r>
+              <w:rPr>
+                <w:rFonts w:ascii="BRH Malayalam Extra" w:hAnsi="BRH Malayalam Extra" w:cs="BRH Malayalam Extra"/>
+                <w:sz w:val="32"/>
+                <w:szCs w:val="40"/>
+              </w:rPr>
+              <w:lastRenderedPageBreak/>
+              <w:t>„„sx „hy P—</w:t>
+            </w:r>
+            <w:proofErr w:type="gramStart"/>
+            <w:r>
+              <w:rPr>
+                <w:rFonts w:ascii="BRH Malayalam Extra" w:hAnsi="BRH Malayalam Extra" w:cs="BRH Malayalam Extra"/>
+                <w:sz w:val="32"/>
+                <w:szCs w:val="40"/>
+              </w:rPr>
+              <w:t>ª.r</w:t>
+            </w:r>
+            <w:proofErr w:type="gramEnd"/>
+            <w:r>
+              <w:rPr>
+                <w:rFonts w:ascii="BRH Malayalam Extra" w:hAnsi="BRH Malayalam Extra" w:cs="BRH Malayalam Extra"/>
+                <w:sz w:val="25"/>
+                <w:szCs w:val="40"/>
+              </w:rPr>
+              <w:t>–</w:t>
+            </w:r>
+            <w:r>
+              <w:rPr>
+                <w:rFonts w:ascii="BRH Malayalam Extra" w:hAnsi="BRH Malayalam Extra" w:cs="BRH Malayalam Extra"/>
+                <w:sz w:val="32"/>
+                <w:szCs w:val="40"/>
+              </w:rPr>
+              <w:t>Yz Ò—</w:t>
+            </w:r>
+            <w:proofErr w:type="gramStart"/>
+            <w:r>
+              <w:rPr>
+                <w:rFonts w:ascii="BRH Malayalam Extra" w:hAnsi="BRH Malayalam Extra" w:cs="BRH Malayalam Extra"/>
+                <w:sz w:val="32"/>
+                <w:szCs w:val="40"/>
+              </w:rPr>
+              <w:t>ª.r</w:t>
+            </w:r>
+            <w:proofErr w:type="gramEnd"/>
             <w:r>
               <w:rPr>
                 <w:rFonts w:ascii="BRH Malayalam Extra" w:hAnsi="BRH Malayalam Extra" w:cs="BRH Malayalam Extra"/>
@@ -26038,21 +26853,31 @@
               </w:rPr>
               <w:t>1</w:t>
             </w:r>
-            <w:r>
-              <w:rPr>
-                <w:rFonts w:ascii="BRH Malayalam Extra" w:hAnsi="BRH Malayalam Extra" w:cs="BRH Malayalam Extra"/>
-                <w:sz w:val="25"/>
-                <w:szCs w:val="40"/>
-              </w:rPr>
-              <w:t>–</w:t>
-            </w:r>
-            <w:r>
-              <w:rPr>
-                <w:rFonts w:ascii="BRH Malayalam Extra" w:hAnsi="BRH Malayalam Extra" w:cs="BRH Malayalam Extra"/>
-                <w:sz w:val="32"/>
-                <w:szCs w:val="40"/>
-              </w:rPr>
-              <w:t>)hõx—sx px¥R—r¡</w:t>
+            <w:proofErr w:type="gramStart"/>
+            <w:r>
+              <w:rPr>
+                <w:rFonts w:ascii="BRH Malayalam Extra" w:hAnsi="BRH Malayalam Extra" w:cs="BRH Malayalam Extra"/>
+                <w:sz w:val="25"/>
+                <w:szCs w:val="40"/>
+              </w:rPr>
+              <w:t>–</w:t>
+            </w:r>
+            <w:r>
+              <w:rPr>
+                <w:rFonts w:ascii="BRH Malayalam Extra" w:hAnsi="BRH Malayalam Extra" w:cs="BRH Malayalam Extra"/>
+                <w:sz w:val="32"/>
+                <w:szCs w:val="40"/>
+              </w:rPr>
+              <w:t>)hõx</w:t>
+            </w:r>
+            <w:proofErr w:type="gramEnd"/>
+            <w:r>
+              <w:rPr>
+                <w:rFonts w:ascii="BRH Malayalam Extra" w:hAnsi="BRH Malayalam Extra" w:cs="BRH Malayalam Extra"/>
+                <w:sz w:val="32"/>
+                <w:szCs w:val="40"/>
+              </w:rPr>
+              <w:t>—sx px¥R—r¡</w:t>
             </w:r>
             <w:r>
               <w:rPr>
@@ -26084,8 +26909,18 @@
                 <w:sz w:val="32"/>
                 <w:szCs w:val="40"/>
               </w:rPr>
-              <w:t>sx „hõx˜(</w:t>
-            </w:r>
+              <w:t>sx „hõx</w:t>
+            </w:r>
+            <w:proofErr w:type="gramStart"/>
+            <w:r>
+              <w:rPr>
+                <w:rFonts w:ascii="BRH Malayalam Extra" w:hAnsi="BRH Malayalam Extra" w:cs="BRH Malayalam Extra"/>
+                <w:sz w:val="32"/>
+                <w:szCs w:val="40"/>
+              </w:rPr>
+              <w:t>˜(</w:t>
+            </w:r>
+            <w:proofErr w:type="gramEnd"/>
             <w:r>
               <w:rPr>
                 <w:rFonts w:cs="BRH Malayalam Extra"/>
@@ -26093,21 +26928,31 @@
               </w:rPr>
               <w:t>1</w:t>
             </w:r>
-            <w:r>
-              <w:rPr>
-                <w:rFonts w:ascii="BRH Malayalam Extra" w:hAnsi="BRH Malayalam Extra" w:cs="BRH Malayalam Extra"/>
-                <w:sz w:val="25"/>
-                <w:szCs w:val="40"/>
-              </w:rPr>
-              <w:t>–</w:t>
-            </w:r>
-            <w:r>
-              <w:rPr>
-                <w:rFonts w:ascii="BRH Malayalam Extra" w:hAnsi="BRH Malayalam Extra" w:cs="BRH Malayalam Extra"/>
-                <w:sz w:val="32"/>
-                <w:szCs w:val="40"/>
-              </w:rPr>
-              <w:t xml:space="preserve">)hõx—sx px¥R—r¡ | </w:t>
+            <w:proofErr w:type="gramStart"/>
+            <w:r>
+              <w:rPr>
+                <w:rFonts w:ascii="BRH Malayalam Extra" w:hAnsi="BRH Malayalam Extra" w:cs="BRH Malayalam Extra"/>
+                <w:sz w:val="25"/>
+                <w:szCs w:val="40"/>
+              </w:rPr>
+              <w:t>–</w:t>
+            </w:r>
+            <w:r>
+              <w:rPr>
+                <w:rFonts w:ascii="BRH Malayalam Extra" w:hAnsi="BRH Malayalam Extra" w:cs="BRH Malayalam Extra"/>
+                <w:sz w:val="32"/>
+                <w:szCs w:val="40"/>
+              </w:rPr>
+              <w:t>)hõx</w:t>
+            </w:r>
+            <w:proofErr w:type="gramEnd"/>
+            <w:r>
+              <w:rPr>
+                <w:rFonts w:ascii="BRH Malayalam Extra" w:hAnsi="BRH Malayalam Extra" w:cs="BRH Malayalam Extra"/>
+                <w:sz w:val="32"/>
+                <w:szCs w:val="40"/>
+              </w:rPr>
+              <w:t xml:space="preserve">—sx px¥R—r¡ | </w:t>
             </w:r>
           </w:p>
         </w:tc>
@@ -26138,6 +26983,7 @@
                 <w:rFonts w:cs="BRH Malayalam Extra"/>
                 <w:szCs w:val="40"/>
               </w:rPr>
+              <w:lastRenderedPageBreak/>
               <w:t>35</w:t>
             </w:r>
             <w:r>
@@ -26493,7 +27339,6 @@
                 <w:rFonts w:cs="BRH Malayalam Extra"/>
                 <w:szCs w:val="40"/>
               </w:rPr>
-              <w:lastRenderedPageBreak/>
               <w:t>36</w:t>
             </w:r>
             <w:r>
@@ -26954,7 +27799,6 @@
                 <w:rFonts w:cs="BRH Malayalam Extra"/>
                 <w:szCs w:val="40"/>
               </w:rPr>
-              <w:lastRenderedPageBreak/>
               <w:t>35</w:t>
             </w:r>
             <w:r>
@@ -27317,7 +28161,6 @@
                 <w:szCs w:val="40"/>
                 <w:lang w:val="it-IT"/>
               </w:rPr>
-              <w:lastRenderedPageBreak/>
               <w:t>36</w:t>
             </w:r>
             <w:r>
@@ -27832,7 +28675,6 @@
                 <w:rFonts w:cs="BRH Malayalam Extra"/>
                 <w:szCs w:val="40"/>
               </w:rPr>
-              <w:lastRenderedPageBreak/>
               <w:t>47</w:t>
             </w:r>
             <w:r>
@@ -28558,27 +29400,8 @@
           <w:sz w:val="28"/>
           <w:szCs w:val="32"/>
         </w:rPr>
-        <w:t>(</w:t>
-      </w:r>
-      <w:proofErr w:type="gramStart"/>
-      <w:r>
-        <w:rPr>
-          <w:b/>
-          <w:bCs/>
-          <w:sz w:val="28"/>
-          <w:szCs w:val="32"/>
-        </w:rPr>
-        <w:t>ignore</w:t>
-      </w:r>
-      <w:proofErr w:type="gramEnd"/>
-      <w:r>
-        <w:rPr>
-          <w:b/>
-          <w:bCs/>
-          <w:sz w:val="28"/>
-          <w:szCs w:val="32"/>
-        </w:rPr>
-        <w:t xml:space="preserve"> those which are already incorporated in your book’s version and date)</w:t>
+        <w:lastRenderedPageBreak/>
+        <w:t>(ignore those which are already incorporated in your book’s version and date)</w:t>
       </w:r>
     </w:p>
     <w:tbl>
@@ -28858,7 +29681,7 @@
 </file>
 
 <file path=word/endnotes.xml><?xml version="1.0" encoding="utf-8"?>
-<w:endnotes xmlns:wpc="http://schemas.microsoft.com/office/word/2010/wordprocessingCanvas" xmlns:cx="http://schemas.microsoft.com/office/drawing/2014/chartex" xmlns:cx1="http://schemas.microsoft.com/office/drawing/2015/9/8/chartex" xmlns:cx2="http://schemas.microsoft.com/office/drawing/2015/10/21/chartex" xmlns:cx3="http://schemas.microsoft.com/office/drawing/2016/5/9/chartex" xmlns:cx4="http://schemas.microsoft.com/office/drawing/2016/5/10/chartex" xmlns:cx5="http://schemas.microsoft.com/office/drawing/2016/5/11/chartex" xmlns:cx6="http://schemas.microsoft.com/office/drawing/2016/5/12/chartex" xmlns:cx7="http://schemas.microsoft.com/office/drawing/2016/5/13/chartex" xmlns:cx8="http://schemas.microsoft.com/office/drawing/2016/5/14/chartex" xmlns:mc="http://schemas.openxmlformats.org/markup-compatibility/2006" xmlns:aink="http://schemas.microsoft.com/office/drawing/2016/ink" xmlns:am3d="http://schemas.microsoft.com/office/drawing/2017/model3d" xmlns:o="urn:schemas-microsoft-com:office:office" xmlns:oel="http://schemas.microsoft.com/office/2019/extlst" xmlns:r="http://schemas.openxmlformats.org/officeDocument/2006/relationships" xmlns:m="http://schemas.openxmlformats.org/officeDocument/2006/math" xmlns:v="urn:schemas-microsoft-com:vml" xmlns:wp14="http://schemas.microsoft.com/office/word/2010/wordprocessingDrawing" xmlns:wp="http://schemas.openxmlformats.org/drawingml/2006/wordprocessingDrawing" xmlns:w10="urn:schemas-microsoft-com:office:word" xmlns:w="http://schemas.openxmlformats.org/wordprocessingml/2006/main" xmlns:w14="http://schemas.microsoft.com/office/word/2010/wordml" xmlns:w15="http://schemas.microsoft.com/office/word/2012/wordml" xmlns:w16cex="http://schemas.microsoft.com/office/word/2018/wordml/cex" xmlns:w16cid="http://schemas.microsoft.com/office/word/2016/wordml/cid" xmlns:w16="http://schemas.microsoft.com/office/word/2018/wordml" xmlns:w16sdtdh="http://schemas.microsoft.com/office/word/2020/wordml/sdtdatahash" xmlns:w16se="http://schemas.microsoft.com/office/word/2015/wordml/symex" xmlns:wpg="http://schemas.microsoft.com/office/word/2010/wordprocessingGroup" xmlns:wpi="http://schemas.microsoft.com/office/word/2010/wordprocessingInk" xmlns:wne="http://schemas.microsoft.com/office/word/2006/wordml" xmlns:wps="http://schemas.microsoft.com/office/word/2010/wordprocessingShape" mc:Ignorable="w14 w15 w16se w16cid w16 w16cex w16sdtdh wp14">
+<w:endnotes xmlns:wpc="http://schemas.microsoft.com/office/word/2010/wordprocessingCanvas" xmlns:cx="http://schemas.microsoft.com/office/drawing/2014/chartex" xmlns:cx1="http://schemas.microsoft.com/office/drawing/2015/9/8/chartex" xmlns:cx2="http://schemas.microsoft.com/office/drawing/2015/10/21/chartex" xmlns:cx3="http://schemas.microsoft.com/office/drawing/2016/5/9/chartex" xmlns:cx4="http://schemas.microsoft.com/office/drawing/2016/5/10/chartex" xmlns:cx5="http://schemas.microsoft.com/office/drawing/2016/5/11/chartex" xmlns:cx6="http://schemas.microsoft.com/office/drawing/2016/5/12/chartex" xmlns:cx7="http://schemas.microsoft.com/office/drawing/2016/5/13/chartex" xmlns:cx8="http://schemas.microsoft.com/office/drawing/2016/5/14/chartex" xmlns:mc="http://schemas.openxmlformats.org/markup-compatibility/2006" xmlns:aink="http://schemas.microsoft.com/office/drawing/2016/ink" xmlns:am3d="http://schemas.microsoft.com/office/drawing/2017/model3d" xmlns:o="urn:schemas-microsoft-com:office:office" xmlns:oel="http://schemas.microsoft.com/office/2019/extlst" xmlns:r="http://schemas.openxmlformats.org/officeDocument/2006/relationships" xmlns:m="http://schemas.openxmlformats.org/officeDocument/2006/math" xmlns:v="urn:schemas-microsoft-com:vml" xmlns:wp14="http://schemas.microsoft.com/office/word/2010/wordprocessingDrawing" xmlns:wp="http://schemas.openxmlformats.org/drawingml/2006/wordprocessingDrawing" xmlns:w10="urn:schemas-microsoft-com:office:word" xmlns:w="http://schemas.openxmlformats.org/wordprocessingml/2006/main" xmlns:w14="http://schemas.microsoft.com/office/word/2010/wordml" xmlns:w15="http://schemas.microsoft.com/office/word/2012/wordml" xmlns:w16cex="http://schemas.microsoft.com/office/word/2018/wordml/cex" xmlns:w16cid="http://schemas.microsoft.com/office/word/2016/wordml/cid" xmlns:w16="http://schemas.microsoft.com/office/word/2018/wordml" xmlns:w16du="http://schemas.microsoft.com/office/word/2023/wordml/word16du" xmlns:w16sdtdh="http://schemas.microsoft.com/office/word/2020/wordml/sdtdatahash" xmlns:w16sdtfl="http://schemas.microsoft.com/office/word/2024/wordml/sdtformatlock" xmlns:w16se="http://schemas.microsoft.com/office/word/2015/wordml/symex" xmlns:wpg="http://schemas.microsoft.com/office/word/2010/wordprocessingGroup" xmlns:wpi="http://schemas.microsoft.com/office/word/2010/wordprocessingInk" xmlns:wne="http://schemas.microsoft.com/office/word/2006/wordml" xmlns:wps="http://schemas.microsoft.com/office/word/2010/wordprocessingShape" mc:Ignorable="w14 w15 w16se w16cid w16 w16cex w16sdtdh w16sdtfl w16du wp14">
   <w:endnote w:type="separator" w:id="-1">
     <w:p>
       <w:pPr>
@@ -28883,7 +29706,7 @@
 </file>
 
 <file path=word/footer1.xml><?xml version="1.0" encoding="utf-8"?>
-<w:ftr xmlns:wpc="http://schemas.microsoft.com/office/word/2010/wordprocessingCanvas" xmlns:cx="http://schemas.microsoft.com/office/drawing/2014/chartex" xmlns:cx1="http://schemas.microsoft.com/office/drawing/2015/9/8/chartex" xmlns:cx2="http://schemas.microsoft.com/office/drawing/2015/10/21/chartex" xmlns:cx3="http://schemas.microsoft.com/office/drawing/2016/5/9/chartex" xmlns:cx4="http://schemas.microsoft.com/office/drawing/2016/5/10/chartex" xmlns:cx5="http://schemas.microsoft.com/office/drawing/2016/5/11/chartex" xmlns:cx6="http://schemas.microsoft.com/office/drawing/2016/5/12/chartex" xmlns:cx7="http://schemas.microsoft.com/office/drawing/2016/5/13/chartex" xmlns:cx8="http://schemas.microsoft.com/office/drawing/2016/5/14/chartex" xmlns:mc="http://schemas.openxmlformats.org/markup-compatibility/2006" xmlns:aink="http://schemas.microsoft.com/office/drawing/2016/ink" xmlns:am3d="http://schemas.microsoft.com/office/drawing/2017/model3d" xmlns:o="urn:schemas-microsoft-com:office:office" xmlns:oel="http://schemas.microsoft.com/office/2019/extlst" xmlns:r="http://schemas.openxmlformats.org/officeDocument/2006/relationships" xmlns:m="http://schemas.openxmlformats.org/officeDocument/2006/math" xmlns:v="urn:schemas-microsoft-com:vml" xmlns:wp14="http://schemas.microsoft.com/office/word/2010/wordprocessingDrawing" xmlns:wp="http://schemas.openxmlformats.org/drawingml/2006/wordprocessingDrawing" xmlns:w10="urn:schemas-microsoft-com:office:word" xmlns:w="http://schemas.openxmlformats.org/wordprocessingml/2006/main" xmlns:w14="http://schemas.microsoft.com/office/word/2010/wordml" xmlns:w15="http://schemas.microsoft.com/office/word/2012/wordml" xmlns:w16cex="http://schemas.microsoft.com/office/word/2018/wordml/cex" xmlns:w16cid="http://schemas.microsoft.com/office/word/2016/wordml/cid" xmlns:w16="http://schemas.microsoft.com/office/word/2018/wordml" xmlns:w16sdtdh="http://schemas.microsoft.com/office/word/2020/wordml/sdtdatahash" xmlns:w16se="http://schemas.microsoft.com/office/word/2015/wordml/symex" xmlns:wpg="http://schemas.microsoft.com/office/word/2010/wordprocessingGroup" xmlns:wpi="http://schemas.microsoft.com/office/word/2010/wordprocessingInk" xmlns:wne="http://schemas.microsoft.com/office/word/2006/wordml" xmlns:wps="http://schemas.microsoft.com/office/word/2010/wordprocessingShape" mc:Ignorable="w14 w15 w16se w16cid w16 w16cex w16sdtdh wp14">
+<w:ftr xmlns:wpc="http://schemas.microsoft.com/office/word/2010/wordprocessingCanvas" xmlns:cx="http://schemas.microsoft.com/office/drawing/2014/chartex" xmlns:cx1="http://schemas.microsoft.com/office/drawing/2015/9/8/chartex" xmlns:cx2="http://schemas.microsoft.com/office/drawing/2015/10/21/chartex" xmlns:cx3="http://schemas.microsoft.com/office/drawing/2016/5/9/chartex" xmlns:cx4="http://schemas.microsoft.com/office/drawing/2016/5/10/chartex" xmlns:cx5="http://schemas.microsoft.com/office/drawing/2016/5/11/chartex" xmlns:cx6="http://schemas.microsoft.com/office/drawing/2016/5/12/chartex" xmlns:cx7="http://schemas.microsoft.com/office/drawing/2016/5/13/chartex" xmlns:cx8="http://schemas.microsoft.com/office/drawing/2016/5/14/chartex" xmlns:mc="http://schemas.openxmlformats.org/markup-compatibility/2006" xmlns:aink="http://schemas.microsoft.com/office/drawing/2016/ink" xmlns:am3d="http://schemas.microsoft.com/office/drawing/2017/model3d" xmlns:o="urn:schemas-microsoft-com:office:office" xmlns:oel="http://schemas.microsoft.com/office/2019/extlst" xmlns:r="http://schemas.openxmlformats.org/officeDocument/2006/relationships" xmlns:m="http://schemas.openxmlformats.org/officeDocument/2006/math" xmlns:v="urn:schemas-microsoft-com:vml" xmlns:wp14="http://schemas.microsoft.com/office/word/2010/wordprocessingDrawing" xmlns:wp="http://schemas.openxmlformats.org/drawingml/2006/wordprocessingDrawing" xmlns:w10="urn:schemas-microsoft-com:office:word" xmlns:w="http://schemas.openxmlformats.org/wordprocessingml/2006/main" xmlns:w14="http://schemas.microsoft.com/office/word/2010/wordml" xmlns:w15="http://schemas.microsoft.com/office/word/2012/wordml" xmlns:w16cex="http://schemas.microsoft.com/office/word/2018/wordml/cex" xmlns:w16cid="http://schemas.microsoft.com/office/word/2016/wordml/cid" xmlns:w16="http://schemas.microsoft.com/office/word/2018/wordml" xmlns:w16du="http://schemas.microsoft.com/office/word/2023/wordml/word16du" xmlns:w16sdtdh="http://schemas.microsoft.com/office/word/2020/wordml/sdtdatahash" xmlns:w16sdtfl="http://schemas.microsoft.com/office/word/2024/wordml/sdtformatlock" xmlns:w16se="http://schemas.microsoft.com/office/word/2015/wordml/symex" xmlns:wpg="http://schemas.microsoft.com/office/word/2010/wordprocessingGroup" xmlns:wpi="http://schemas.microsoft.com/office/word/2010/wordprocessingInk" xmlns:wne="http://schemas.microsoft.com/office/word/2006/wordml" xmlns:wps="http://schemas.microsoft.com/office/word/2010/wordprocessingShape" mc:Ignorable="w14 w15 w16se w16cid w16 w16cex w16sdtdh w16sdtfl w16du wp14">
   <w:p>
     <w:pPr>
       <w:pBdr>
@@ -29068,7 +29891,7 @@
 </file>
 
 <file path=word/footer2.xml><?xml version="1.0" encoding="utf-8"?>
-<w:ftr xmlns:wpc="http://schemas.microsoft.com/office/word/2010/wordprocessingCanvas" xmlns:cx="http://schemas.microsoft.com/office/drawing/2014/chartex" xmlns:cx1="http://schemas.microsoft.com/office/drawing/2015/9/8/chartex" xmlns:cx2="http://schemas.microsoft.com/office/drawing/2015/10/21/chartex" xmlns:cx3="http://schemas.microsoft.com/office/drawing/2016/5/9/chartex" xmlns:cx4="http://schemas.microsoft.com/office/drawing/2016/5/10/chartex" xmlns:cx5="http://schemas.microsoft.com/office/drawing/2016/5/11/chartex" xmlns:cx6="http://schemas.microsoft.com/office/drawing/2016/5/12/chartex" xmlns:cx7="http://schemas.microsoft.com/office/drawing/2016/5/13/chartex" xmlns:cx8="http://schemas.microsoft.com/office/drawing/2016/5/14/chartex" xmlns:mc="http://schemas.openxmlformats.org/markup-compatibility/2006" xmlns:aink="http://schemas.microsoft.com/office/drawing/2016/ink" xmlns:am3d="http://schemas.microsoft.com/office/drawing/2017/model3d" xmlns:o="urn:schemas-microsoft-com:office:office" xmlns:oel="http://schemas.microsoft.com/office/2019/extlst" xmlns:r="http://schemas.openxmlformats.org/officeDocument/2006/relationships" xmlns:m="http://schemas.openxmlformats.org/officeDocument/2006/math" xmlns:v="urn:schemas-microsoft-com:vml" xmlns:wp14="http://schemas.microsoft.com/office/word/2010/wordprocessingDrawing" xmlns:wp="http://schemas.openxmlformats.org/drawingml/2006/wordprocessingDrawing" xmlns:w10="urn:schemas-microsoft-com:office:word" xmlns:w="http://schemas.openxmlformats.org/wordprocessingml/2006/main" xmlns:w14="http://schemas.microsoft.com/office/word/2010/wordml" xmlns:w15="http://schemas.microsoft.com/office/word/2012/wordml" xmlns:w16cex="http://schemas.microsoft.com/office/word/2018/wordml/cex" xmlns:w16cid="http://schemas.microsoft.com/office/word/2016/wordml/cid" xmlns:w16="http://schemas.microsoft.com/office/word/2018/wordml" xmlns:w16sdtdh="http://schemas.microsoft.com/office/word/2020/wordml/sdtdatahash" xmlns:w16se="http://schemas.microsoft.com/office/word/2015/wordml/symex" xmlns:wpg="http://schemas.microsoft.com/office/word/2010/wordprocessingGroup" xmlns:wpi="http://schemas.microsoft.com/office/word/2010/wordprocessingInk" xmlns:wne="http://schemas.microsoft.com/office/word/2006/wordml" xmlns:wps="http://schemas.microsoft.com/office/word/2010/wordprocessingShape" mc:Ignorable="w14 w15 w16se w16cid w16 w16cex w16sdtdh wp14">
+<w:ftr xmlns:wpc="http://schemas.microsoft.com/office/word/2010/wordprocessingCanvas" xmlns:cx="http://schemas.microsoft.com/office/drawing/2014/chartex" xmlns:cx1="http://schemas.microsoft.com/office/drawing/2015/9/8/chartex" xmlns:cx2="http://schemas.microsoft.com/office/drawing/2015/10/21/chartex" xmlns:cx3="http://schemas.microsoft.com/office/drawing/2016/5/9/chartex" xmlns:cx4="http://schemas.microsoft.com/office/drawing/2016/5/10/chartex" xmlns:cx5="http://schemas.microsoft.com/office/drawing/2016/5/11/chartex" xmlns:cx6="http://schemas.microsoft.com/office/drawing/2016/5/12/chartex" xmlns:cx7="http://schemas.microsoft.com/office/drawing/2016/5/13/chartex" xmlns:cx8="http://schemas.microsoft.com/office/drawing/2016/5/14/chartex" xmlns:mc="http://schemas.openxmlformats.org/markup-compatibility/2006" xmlns:aink="http://schemas.microsoft.com/office/drawing/2016/ink" xmlns:am3d="http://schemas.microsoft.com/office/drawing/2017/model3d" xmlns:o="urn:schemas-microsoft-com:office:office" xmlns:oel="http://schemas.microsoft.com/office/2019/extlst" xmlns:r="http://schemas.openxmlformats.org/officeDocument/2006/relationships" xmlns:m="http://schemas.openxmlformats.org/officeDocument/2006/math" xmlns:v="urn:schemas-microsoft-com:vml" xmlns:wp14="http://schemas.microsoft.com/office/word/2010/wordprocessingDrawing" xmlns:wp="http://schemas.openxmlformats.org/drawingml/2006/wordprocessingDrawing" xmlns:w10="urn:schemas-microsoft-com:office:word" xmlns:w="http://schemas.openxmlformats.org/wordprocessingml/2006/main" xmlns:w14="http://schemas.microsoft.com/office/word/2010/wordml" xmlns:w15="http://schemas.microsoft.com/office/word/2012/wordml" xmlns:w16cex="http://schemas.microsoft.com/office/word/2018/wordml/cex" xmlns:w16cid="http://schemas.microsoft.com/office/word/2016/wordml/cid" xmlns:w16="http://schemas.microsoft.com/office/word/2018/wordml" xmlns:w16du="http://schemas.microsoft.com/office/word/2023/wordml/word16du" xmlns:w16sdtdh="http://schemas.microsoft.com/office/word/2020/wordml/sdtdatahash" xmlns:w16sdtfl="http://schemas.microsoft.com/office/word/2024/wordml/sdtformatlock" xmlns:w16se="http://schemas.microsoft.com/office/word/2015/wordml/symex" xmlns:wpg="http://schemas.microsoft.com/office/word/2010/wordprocessingGroup" xmlns:wpi="http://schemas.microsoft.com/office/word/2010/wordprocessingInk" xmlns:wne="http://schemas.microsoft.com/office/word/2006/wordml" xmlns:wps="http://schemas.microsoft.com/office/word/2010/wordprocessingShape" mc:Ignorable="w14 w15 w16se w16cid w16 w16cex w16sdtdh w16sdtfl w16du wp14">
   <w:p>
     <w:pPr>
       <w:pBdr>
@@ -29274,7 +30097,7 @@
 </file>
 
 <file path=word/footnotes.xml><?xml version="1.0" encoding="utf-8"?>
-<w:footnotes xmlns:wpc="http://schemas.microsoft.com/office/word/2010/wordprocessingCanvas" xmlns:cx="http://schemas.microsoft.com/office/drawing/2014/chartex" xmlns:cx1="http://schemas.microsoft.com/office/drawing/2015/9/8/chartex" xmlns:cx2="http://schemas.microsoft.com/office/drawing/2015/10/21/chartex" xmlns:cx3="http://schemas.microsoft.com/office/drawing/2016/5/9/chartex" xmlns:cx4="http://schemas.microsoft.com/office/drawing/2016/5/10/chartex" xmlns:cx5="http://schemas.microsoft.com/office/drawing/2016/5/11/chartex" xmlns:cx6="http://schemas.microsoft.com/office/drawing/2016/5/12/chartex" xmlns:cx7="http://schemas.microsoft.com/office/drawing/2016/5/13/chartex" xmlns:cx8="http://schemas.microsoft.com/office/drawing/2016/5/14/chartex" xmlns:mc="http://schemas.openxmlformats.org/markup-compatibility/2006" xmlns:aink="http://schemas.microsoft.com/office/drawing/2016/ink" xmlns:am3d="http://schemas.microsoft.com/office/drawing/2017/model3d" xmlns:o="urn:schemas-microsoft-com:office:office" xmlns:oel="http://schemas.microsoft.com/office/2019/extlst" xmlns:r="http://schemas.openxmlformats.org/officeDocument/2006/relationships" xmlns:m="http://schemas.openxmlformats.org/officeDocument/2006/math" xmlns:v="urn:schemas-microsoft-com:vml" xmlns:wp14="http://schemas.microsoft.com/office/word/2010/wordprocessingDrawing" xmlns:wp="http://schemas.openxmlformats.org/drawingml/2006/wordprocessingDrawing" xmlns:w10="urn:schemas-microsoft-com:office:word" xmlns:w="http://schemas.openxmlformats.org/wordprocessingml/2006/main" xmlns:w14="http://schemas.microsoft.com/office/word/2010/wordml" xmlns:w15="http://schemas.microsoft.com/office/word/2012/wordml" xmlns:w16cex="http://schemas.microsoft.com/office/word/2018/wordml/cex" xmlns:w16cid="http://schemas.microsoft.com/office/word/2016/wordml/cid" xmlns:w16="http://schemas.microsoft.com/office/word/2018/wordml" xmlns:w16sdtdh="http://schemas.microsoft.com/office/word/2020/wordml/sdtdatahash" xmlns:w16se="http://schemas.microsoft.com/office/word/2015/wordml/symex" xmlns:wpg="http://schemas.microsoft.com/office/word/2010/wordprocessingGroup" xmlns:wpi="http://schemas.microsoft.com/office/word/2010/wordprocessingInk" xmlns:wne="http://schemas.microsoft.com/office/word/2006/wordml" xmlns:wps="http://schemas.microsoft.com/office/word/2010/wordprocessingShape" mc:Ignorable="w14 w15 w16se w16cid w16 w16cex w16sdtdh wp14">
+<w:footnotes xmlns:wpc="http://schemas.microsoft.com/office/word/2010/wordprocessingCanvas" xmlns:cx="http://schemas.microsoft.com/office/drawing/2014/chartex" xmlns:cx1="http://schemas.microsoft.com/office/drawing/2015/9/8/chartex" xmlns:cx2="http://schemas.microsoft.com/office/drawing/2015/10/21/chartex" xmlns:cx3="http://schemas.microsoft.com/office/drawing/2016/5/9/chartex" xmlns:cx4="http://schemas.microsoft.com/office/drawing/2016/5/10/chartex" xmlns:cx5="http://schemas.microsoft.com/office/drawing/2016/5/11/chartex" xmlns:cx6="http://schemas.microsoft.com/office/drawing/2016/5/12/chartex" xmlns:cx7="http://schemas.microsoft.com/office/drawing/2016/5/13/chartex" xmlns:cx8="http://schemas.microsoft.com/office/drawing/2016/5/14/chartex" xmlns:mc="http://schemas.openxmlformats.org/markup-compatibility/2006" xmlns:aink="http://schemas.microsoft.com/office/drawing/2016/ink" xmlns:am3d="http://schemas.microsoft.com/office/drawing/2017/model3d" xmlns:o="urn:schemas-microsoft-com:office:office" xmlns:oel="http://schemas.microsoft.com/office/2019/extlst" xmlns:r="http://schemas.openxmlformats.org/officeDocument/2006/relationships" xmlns:m="http://schemas.openxmlformats.org/officeDocument/2006/math" xmlns:v="urn:schemas-microsoft-com:vml" xmlns:wp14="http://schemas.microsoft.com/office/word/2010/wordprocessingDrawing" xmlns:wp="http://schemas.openxmlformats.org/drawingml/2006/wordprocessingDrawing" xmlns:w10="urn:schemas-microsoft-com:office:word" xmlns:w="http://schemas.openxmlformats.org/wordprocessingml/2006/main" xmlns:w14="http://schemas.microsoft.com/office/word/2010/wordml" xmlns:w15="http://schemas.microsoft.com/office/word/2012/wordml" xmlns:w16cex="http://schemas.microsoft.com/office/word/2018/wordml/cex" xmlns:w16cid="http://schemas.microsoft.com/office/word/2016/wordml/cid" xmlns:w16="http://schemas.microsoft.com/office/word/2018/wordml" xmlns:w16du="http://schemas.microsoft.com/office/word/2023/wordml/word16du" xmlns:w16sdtdh="http://schemas.microsoft.com/office/word/2020/wordml/sdtdatahash" xmlns:w16sdtfl="http://schemas.microsoft.com/office/word/2024/wordml/sdtformatlock" xmlns:w16se="http://schemas.microsoft.com/office/word/2015/wordml/symex" xmlns:wpg="http://schemas.microsoft.com/office/word/2010/wordprocessingGroup" xmlns:wpi="http://schemas.microsoft.com/office/word/2010/wordprocessingInk" xmlns:wne="http://schemas.microsoft.com/office/word/2006/wordml" xmlns:wps="http://schemas.microsoft.com/office/word/2010/wordprocessingShape" mc:Ignorable="w14 w15 w16se w16cid w16 w16cex w16sdtdh w16sdtfl w16du wp14">
   <w:footnote w:type="separator" w:id="-1">
     <w:p>
       <w:pPr>
@@ -29299,7 +30122,7 @@
 </file>
 
 <file path=word/header1.xml><?xml version="1.0" encoding="utf-8"?>
-<w:hdr xmlns:wpc="http://schemas.microsoft.com/office/word/2010/wordprocessingCanvas" xmlns:cx="http://schemas.microsoft.com/office/drawing/2014/chartex" xmlns:cx1="http://schemas.microsoft.com/office/drawing/2015/9/8/chartex" xmlns:cx2="http://schemas.microsoft.com/office/drawing/2015/10/21/chartex" xmlns:cx3="http://schemas.microsoft.com/office/drawing/2016/5/9/chartex" xmlns:cx4="http://schemas.microsoft.com/office/drawing/2016/5/10/chartex" xmlns:cx5="http://schemas.microsoft.com/office/drawing/2016/5/11/chartex" xmlns:cx6="http://schemas.microsoft.com/office/drawing/2016/5/12/chartex" xmlns:cx7="http://schemas.microsoft.com/office/drawing/2016/5/13/chartex" xmlns:cx8="http://schemas.microsoft.com/office/drawing/2016/5/14/chartex" xmlns:mc="http://schemas.openxmlformats.org/markup-compatibility/2006" xmlns:aink="http://schemas.microsoft.com/office/drawing/2016/ink" xmlns:am3d="http://schemas.microsoft.com/office/drawing/2017/model3d" xmlns:o="urn:schemas-microsoft-com:office:office" xmlns:oel="http://schemas.microsoft.com/office/2019/extlst" xmlns:r="http://schemas.openxmlformats.org/officeDocument/2006/relationships" xmlns:m="http://schemas.openxmlformats.org/officeDocument/2006/math" xmlns:v="urn:schemas-microsoft-com:vml" xmlns:wp14="http://schemas.microsoft.com/office/word/2010/wordprocessingDrawing" xmlns:wp="http://schemas.openxmlformats.org/drawingml/2006/wordprocessingDrawing" xmlns:w10="urn:schemas-microsoft-com:office:word" xmlns:w="http://schemas.openxmlformats.org/wordprocessingml/2006/main" xmlns:w14="http://schemas.microsoft.com/office/word/2010/wordml" xmlns:w15="http://schemas.microsoft.com/office/word/2012/wordml" xmlns:w16cex="http://schemas.microsoft.com/office/word/2018/wordml/cex" xmlns:w16cid="http://schemas.microsoft.com/office/word/2016/wordml/cid" xmlns:w16="http://schemas.microsoft.com/office/word/2018/wordml" xmlns:w16sdtdh="http://schemas.microsoft.com/office/word/2020/wordml/sdtdatahash" xmlns:w16se="http://schemas.microsoft.com/office/word/2015/wordml/symex" xmlns:wpg="http://schemas.microsoft.com/office/word/2010/wordprocessingGroup" xmlns:wpi="http://schemas.microsoft.com/office/word/2010/wordprocessingInk" xmlns:wne="http://schemas.microsoft.com/office/word/2006/wordml" xmlns:wps="http://schemas.microsoft.com/office/word/2010/wordprocessingShape" mc:Ignorable="w14 w15 w16se w16cid w16 w16cex w16sdtdh wp14">
+<w:hdr xmlns:wpc="http://schemas.microsoft.com/office/word/2010/wordprocessingCanvas" xmlns:cx="http://schemas.microsoft.com/office/drawing/2014/chartex" xmlns:cx1="http://schemas.microsoft.com/office/drawing/2015/9/8/chartex" xmlns:cx2="http://schemas.microsoft.com/office/drawing/2015/10/21/chartex" xmlns:cx3="http://schemas.microsoft.com/office/drawing/2016/5/9/chartex" xmlns:cx4="http://schemas.microsoft.com/office/drawing/2016/5/10/chartex" xmlns:cx5="http://schemas.microsoft.com/office/drawing/2016/5/11/chartex" xmlns:cx6="http://schemas.microsoft.com/office/drawing/2016/5/12/chartex" xmlns:cx7="http://schemas.microsoft.com/office/drawing/2016/5/13/chartex" xmlns:cx8="http://schemas.microsoft.com/office/drawing/2016/5/14/chartex" xmlns:mc="http://schemas.openxmlformats.org/markup-compatibility/2006" xmlns:aink="http://schemas.microsoft.com/office/drawing/2016/ink" xmlns:am3d="http://schemas.microsoft.com/office/drawing/2017/model3d" xmlns:o="urn:schemas-microsoft-com:office:office" xmlns:oel="http://schemas.microsoft.com/office/2019/extlst" xmlns:r="http://schemas.openxmlformats.org/officeDocument/2006/relationships" xmlns:m="http://schemas.openxmlformats.org/officeDocument/2006/math" xmlns:v="urn:schemas-microsoft-com:vml" xmlns:wp14="http://schemas.microsoft.com/office/word/2010/wordprocessingDrawing" xmlns:wp="http://schemas.openxmlformats.org/drawingml/2006/wordprocessingDrawing" xmlns:w10="urn:schemas-microsoft-com:office:word" xmlns:w="http://schemas.openxmlformats.org/wordprocessingml/2006/main" xmlns:w14="http://schemas.microsoft.com/office/word/2010/wordml" xmlns:w15="http://schemas.microsoft.com/office/word/2012/wordml" xmlns:w16cex="http://schemas.microsoft.com/office/word/2018/wordml/cex" xmlns:w16cid="http://schemas.microsoft.com/office/word/2016/wordml/cid" xmlns:w16="http://schemas.microsoft.com/office/word/2018/wordml" xmlns:w16du="http://schemas.microsoft.com/office/word/2023/wordml/word16du" xmlns:w16sdtdh="http://schemas.microsoft.com/office/word/2020/wordml/sdtdatahash" xmlns:w16sdtfl="http://schemas.microsoft.com/office/word/2024/wordml/sdtformatlock" xmlns:w16se="http://schemas.microsoft.com/office/word/2015/wordml/symex" xmlns:wpg="http://schemas.microsoft.com/office/word/2010/wordprocessingGroup" xmlns:wpi="http://schemas.microsoft.com/office/word/2010/wordprocessingInk" xmlns:wne="http://schemas.microsoft.com/office/word/2006/wordml" xmlns:wps="http://schemas.microsoft.com/office/word/2010/wordprocessingShape" mc:Ignorable="w14 w15 w16se w16cid w16 w16cex w16sdtdh w16sdtfl w16du wp14">
   <w:p>
     <w:pPr>
       <w:pStyle w:val="Header"/>
@@ -29320,7 +30143,7 @@
 </file>
 
 <file path=word/header2.xml><?xml version="1.0" encoding="utf-8"?>
-<w:hdr xmlns:wpc="http://schemas.microsoft.com/office/word/2010/wordprocessingCanvas" xmlns:cx="http://schemas.microsoft.com/office/drawing/2014/chartex" xmlns:cx1="http://schemas.microsoft.com/office/drawing/2015/9/8/chartex" xmlns:cx2="http://schemas.microsoft.com/office/drawing/2015/10/21/chartex" xmlns:cx3="http://schemas.microsoft.com/office/drawing/2016/5/9/chartex" xmlns:cx4="http://schemas.microsoft.com/office/drawing/2016/5/10/chartex" xmlns:cx5="http://schemas.microsoft.com/office/drawing/2016/5/11/chartex" xmlns:cx6="http://schemas.microsoft.com/office/drawing/2016/5/12/chartex" xmlns:cx7="http://schemas.microsoft.com/office/drawing/2016/5/13/chartex" xmlns:cx8="http://schemas.microsoft.com/office/drawing/2016/5/14/chartex" xmlns:mc="http://schemas.openxmlformats.org/markup-compatibility/2006" xmlns:aink="http://schemas.microsoft.com/office/drawing/2016/ink" xmlns:am3d="http://schemas.microsoft.com/office/drawing/2017/model3d" xmlns:o="urn:schemas-microsoft-com:office:office" xmlns:oel="http://schemas.microsoft.com/office/2019/extlst" xmlns:r="http://schemas.openxmlformats.org/officeDocument/2006/relationships" xmlns:m="http://schemas.openxmlformats.org/officeDocument/2006/math" xmlns:v="urn:schemas-microsoft-com:vml" xmlns:wp14="http://schemas.microsoft.com/office/word/2010/wordprocessingDrawing" xmlns:wp="http://schemas.openxmlformats.org/drawingml/2006/wordprocessingDrawing" xmlns:w10="urn:schemas-microsoft-com:office:word" xmlns:w="http://schemas.openxmlformats.org/wordprocessingml/2006/main" xmlns:w14="http://schemas.microsoft.com/office/word/2010/wordml" xmlns:w15="http://schemas.microsoft.com/office/word/2012/wordml" xmlns:w16cex="http://schemas.microsoft.com/office/word/2018/wordml/cex" xmlns:w16cid="http://schemas.microsoft.com/office/word/2016/wordml/cid" xmlns:w16="http://schemas.microsoft.com/office/word/2018/wordml" xmlns:w16sdtdh="http://schemas.microsoft.com/office/word/2020/wordml/sdtdatahash" xmlns:w16se="http://schemas.microsoft.com/office/word/2015/wordml/symex" xmlns:wpg="http://schemas.microsoft.com/office/word/2010/wordprocessingGroup" xmlns:wpi="http://schemas.microsoft.com/office/word/2010/wordprocessingInk" xmlns:wne="http://schemas.microsoft.com/office/word/2006/wordml" xmlns:wps="http://schemas.microsoft.com/office/word/2010/wordprocessingShape" mc:Ignorable="w14 w15 w16se w16cid w16 w16cex w16sdtdh wp14">
+<w:hdr xmlns:wpc="http://schemas.microsoft.com/office/word/2010/wordprocessingCanvas" xmlns:cx="http://schemas.microsoft.com/office/drawing/2014/chartex" xmlns:cx1="http://schemas.microsoft.com/office/drawing/2015/9/8/chartex" xmlns:cx2="http://schemas.microsoft.com/office/drawing/2015/10/21/chartex" xmlns:cx3="http://schemas.microsoft.com/office/drawing/2016/5/9/chartex" xmlns:cx4="http://schemas.microsoft.com/office/drawing/2016/5/10/chartex" xmlns:cx5="http://schemas.microsoft.com/office/drawing/2016/5/11/chartex" xmlns:cx6="http://schemas.microsoft.com/office/drawing/2016/5/12/chartex" xmlns:cx7="http://schemas.microsoft.com/office/drawing/2016/5/13/chartex" xmlns:cx8="http://schemas.microsoft.com/office/drawing/2016/5/14/chartex" xmlns:mc="http://schemas.openxmlformats.org/markup-compatibility/2006" xmlns:aink="http://schemas.microsoft.com/office/drawing/2016/ink" xmlns:am3d="http://schemas.microsoft.com/office/drawing/2017/model3d" xmlns:o="urn:schemas-microsoft-com:office:office" xmlns:oel="http://schemas.microsoft.com/office/2019/extlst" xmlns:r="http://schemas.openxmlformats.org/officeDocument/2006/relationships" xmlns:m="http://schemas.openxmlformats.org/officeDocument/2006/math" xmlns:v="urn:schemas-microsoft-com:vml" xmlns:wp14="http://schemas.microsoft.com/office/word/2010/wordprocessingDrawing" xmlns:wp="http://schemas.openxmlformats.org/drawingml/2006/wordprocessingDrawing" xmlns:w10="urn:schemas-microsoft-com:office:word" xmlns:w="http://schemas.openxmlformats.org/wordprocessingml/2006/main" xmlns:w14="http://schemas.microsoft.com/office/word/2010/wordml" xmlns:w15="http://schemas.microsoft.com/office/word/2012/wordml" xmlns:w16cex="http://schemas.microsoft.com/office/word/2018/wordml/cex" xmlns:w16cid="http://schemas.microsoft.com/office/word/2016/wordml/cid" xmlns:w16="http://schemas.microsoft.com/office/word/2018/wordml" xmlns:w16du="http://schemas.microsoft.com/office/word/2023/wordml/word16du" xmlns:w16sdtdh="http://schemas.microsoft.com/office/word/2020/wordml/sdtdatahash" xmlns:w16sdtfl="http://schemas.microsoft.com/office/word/2024/wordml/sdtformatlock" xmlns:w16se="http://schemas.microsoft.com/office/word/2015/wordml/symex" xmlns:wpg="http://schemas.microsoft.com/office/word/2010/wordprocessingGroup" xmlns:wpi="http://schemas.microsoft.com/office/word/2010/wordprocessingInk" xmlns:wne="http://schemas.microsoft.com/office/word/2006/wordml" xmlns:wps="http://schemas.microsoft.com/office/word/2010/wordprocessingShape" mc:Ignorable="w14 w15 w16se w16cid w16 w16cex w16sdtdh w16sdtfl w16du wp14">
   <w:p>
     <w:pPr>
       <w:pStyle w:val="Header"/>
@@ -29333,7 +30156,7 @@
 </file>
 
 <file path=word/styles.xml><?xml version="1.0" encoding="utf-8"?>
-<w:styles xmlns:mc="http://schemas.openxmlformats.org/markup-compatibility/2006" xmlns:r="http://schemas.openxmlformats.org/officeDocument/2006/relationships" xmlns:w="http://schemas.openxmlformats.org/wordprocessingml/2006/main" xmlns:w14="http://schemas.microsoft.com/office/word/2010/wordml" xmlns:w15="http://schemas.microsoft.com/office/word/2012/wordml" xmlns:w16cex="http://schemas.microsoft.com/office/word/2018/wordml/cex" xmlns:w16cid="http://schemas.microsoft.com/office/word/2016/wordml/cid" xmlns:w16="http://schemas.microsoft.com/office/word/2018/wordml" xmlns:w16sdtdh="http://schemas.microsoft.com/office/word/2020/wordml/sdtdatahash" xmlns:w16se="http://schemas.microsoft.com/office/word/2015/wordml/symex" mc:Ignorable="w14 w15 w16se w16cid w16 w16cex w16sdtdh">
+<w:styles xmlns:mc="http://schemas.openxmlformats.org/markup-compatibility/2006" xmlns:r="http://schemas.openxmlformats.org/officeDocument/2006/relationships" xmlns:w="http://schemas.openxmlformats.org/wordprocessingml/2006/main" xmlns:w14="http://schemas.microsoft.com/office/word/2010/wordml" xmlns:w15="http://schemas.microsoft.com/office/word/2012/wordml" xmlns:w16cex="http://schemas.microsoft.com/office/word/2018/wordml/cex" xmlns:w16cid="http://schemas.microsoft.com/office/word/2016/wordml/cid" xmlns:w16="http://schemas.microsoft.com/office/word/2018/wordml" xmlns:w16du="http://schemas.microsoft.com/office/word/2023/wordml/word16du" xmlns:w16sdtdh="http://schemas.microsoft.com/office/word/2020/wordml/sdtdatahash" xmlns:w16sdtfl="http://schemas.microsoft.com/office/word/2024/wordml/sdtformatlock" xmlns:w16se="http://schemas.microsoft.com/office/word/2015/wordml/symex" mc:Ignorable="w14 w15 w16se w16cid w16 w16cex w16sdtdh w16sdtfl w16du">
   <w:docDefaults>
     <w:rPrDefault>
       <w:rPr>

</xml_diff>